<commit_message>
Add Polish Ministry journal points to publication list
Each entry now ends with bold: Cited N times. IF=X.X/QY. Points=Z.
Coverage: 397 citations (100%), 376 IF/Q (94.7%), 385 Polish points (97%).
Remaining gaps are new/unlisted journals not yet in 2024 ministerial list.

Co-Authored-By: Claude Sonnet 4.6 <noreply@anthropic.com>
Claude-Session: https://claude.ai/code/session_01RpDuB1dhNB1FLNgvaELYNX
</commit_message>
<xml_diff>
--- a/Atanasov_Publications_NLM.docx
+++ b/Atanasov_Publications_NLM.docx
@@ -34,7 +34,7 @@
           <w:b/>
           <w:sz w:val="22"/>
         </w:rPr>
-        <w:t xml:space="preserve"> Cited 0 times. IF=5.2/Q1.</w:t>
+        <w:t xml:space="preserve"> Cited 0 times. IF=5.2/Q1. Points=20.</w:t>
       </w:r>
     </w:p>
     <w:p>
@@ -52,7 +52,7 @@
           <w:b/>
           <w:sz w:val="22"/>
         </w:rPr>
-        <w:t xml:space="preserve"> Cited 0 times. IF=2/Q3.</w:t>
+        <w:t xml:space="preserve"> Cited 0 times. IF=2/Q3. Points=70.</w:t>
       </w:r>
     </w:p>
     <w:p>
@@ -70,7 +70,7 @@
           <w:b/>
           <w:sz w:val="22"/>
         </w:rPr>
-        <w:t xml:space="preserve"> Cited 1 times. IF=25.5/Q1.</w:t>
+        <w:t xml:space="preserve"> Cited 1 times. IF=25.5/Q1. Points=20.</w:t>
       </w:r>
     </w:p>
     <w:p>
@@ -88,7 +88,7 @@
           <w:b/>
           <w:sz w:val="22"/>
         </w:rPr>
-        <w:t xml:space="preserve"> Cited 0 times. IF=3.1/Q2.</w:t>
+        <w:t xml:space="preserve"> Cited 0 times. IF=3.1/Q2. Points=70.</w:t>
       </w:r>
     </w:p>
     <w:p>
@@ -106,7 +106,7 @@
           <w:b/>
           <w:sz w:val="22"/>
         </w:rPr>
-        <w:t xml:space="preserve"> Cited 0 times. IF=2.8/Q2.</w:t>
+        <w:t xml:space="preserve"> Cited 0 times. IF=2.8/Q2. Points=100.</w:t>
       </w:r>
     </w:p>
     <w:p>
@@ -142,7 +142,7 @@
           <w:b/>
           <w:sz w:val="22"/>
         </w:rPr>
-        <w:t xml:space="preserve"> Cited 0 times. IF=1.1/Q3.</w:t>
+        <w:t xml:space="preserve"> Cited 0 times. IF=1.1/Q3. Points=100.</w:t>
       </w:r>
     </w:p>
     <w:p>
@@ -160,7 +160,7 @@
           <w:b/>
           <w:sz w:val="22"/>
         </w:rPr>
-        <w:t xml:space="preserve"> Cited 1 times. IF=5.1/Q1.</w:t>
+        <w:t xml:space="preserve"> Cited 1 times. IF=5.1/Q1. Points=100.</w:t>
       </w:r>
     </w:p>
     <w:p>
@@ -178,7 +178,7 @@
           <w:b/>
           <w:sz w:val="22"/>
         </w:rPr>
-        <w:t xml:space="preserve"> Cited 0 times. IF=1.4/Q3.</w:t>
+        <w:t xml:space="preserve"> Cited 0 times. IF=1.4/Q3. Points=100.</w:t>
       </w:r>
     </w:p>
     <w:p>
@@ -204,7 +204,7 @@
           <w:b/>
           <w:sz w:val="22"/>
         </w:rPr>
-        <w:t xml:space="preserve"> Cited 1 times. IF=14.1/Q1.</w:t>
+        <w:t xml:space="preserve"> Cited 1 times. IF=14.1/Q1. Points=20.</w:t>
       </w:r>
     </w:p>
     <w:p>
@@ -222,7 +222,7 @@
           <w:b/>
           <w:sz w:val="22"/>
         </w:rPr>
-        <w:t xml:space="preserve"> Cited 2 times. IF=3.6/Q2.</w:t>
+        <w:t xml:space="preserve"> Cited 2 times. IF=3.6/Q2. Points=140.</w:t>
       </w:r>
     </w:p>
     <w:p>
@@ -240,7 +240,7 @@
           <w:b/>
           <w:sz w:val="22"/>
         </w:rPr>
-        <w:t xml:space="preserve"> Cited 0 times. IF=5.2/Q1.</w:t>
+        <w:t xml:space="preserve"> Cited 0 times. IF=5.2/Q1. Points=20.</w:t>
       </w:r>
     </w:p>
     <w:p>
@@ -276,7 +276,7 @@
           <w:b/>
           <w:sz w:val="22"/>
         </w:rPr>
-        <w:t xml:space="preserve"> Cited 5 times. IF=1.7/Q3.</w:t>
+        <w:t xml:space="preserve"> Cited 5 times. IF=1.7/Q3. Points=100.</w:t>
       </w:r>
     </w:p>
     <w:p>
@@ -294,7 +294,7 @@
           <w:b/>
           <w:sz w:val="22"/>
         </w:rPr>
-        <w:t xml:space="preserve"> Cited 6 times. IF=1.1/Q3.</w:t>
+        <w:t xml:space="preserve"> Cited 6 times. IF=1.1/Q3. Points=100.</w:t>
       </w:r>
     </w:p>
     <w:p>
@@ -312,7 +312,7 @@
           <w:b/>
           <w:sz w:val="22"/>
         </w:rPr>
-        <w:t xml:space="preserve"> Cited 3 times. IF=2.6/Q3.</w:t>
+        <w:t xml:space="preserve"> Cited 3 times. IF=2.6/Q3. Points=70.</w:t>
       </w:r>
     </w:p>
     <w:p>
@@ -348,7 +348,7 @@
           <w:b/>
           <w:sz w:val="22"/>
         </w:rPr>
-        <w:t xml:space="preserve"> Cited 0 times. IF=6.7/Q1.</w:t>
+        <w:t xml:space="preserve"> Cited 0 times. IF=6.7/Q1. Points=20.</w:t>
       </w:r>
     </w:p>
     <w:p>
@@ -366,7 +366,7 @@
           <w:b/>
           <w:sz w:val="22"/>
         </w:rPr>
-        <w:t xml:space="preserve"> Cited 17 times. IF=3.6/Q1.</w:t>
+        <w:t xml:space="preserve"> Cited 17 times. IF=3.6/Q1. Points=100.</w:t>
       </w:r>
     </w:p>
     <w:p>
@@ -384,7 +384,7 @@
           <w:b/>
           <w:sz w:val="22"/>
         </w:rPr>
-        <w:t xml:space="preserve"> Cited 1 times. IF=2.4/Q2.</w:t>
+        <w:t xml:space="preserve"> Cited 1 times. IF=2.4/Q2. Points=70.</w:t>
       </w:r>
     </w:p>
     <w:p>
@@ -402,7 +402,7 @@
           <w:b/>
           <w:sz w:val="22"/>
         </w:rPr>
-        <w:t xml:space="preserve"> Cited 2 times. IF=1.1/Q3.</w:t>
+        <w:t xml:space="preserve"> Cited 2 times. IF=1.1/Q3. Points=100.</w:t>
       </w:r>
     </w:p>
     <w:p>
@@ -420,7 +420,7 @@
           <w:b/>
           <w:sz w:val="22"/>
         </w:rPr>
-        <w:t xml:space="preserve"> Cited 0 times. IF=1.8/Q3.</w:t>
+        <w:t xml:space="preserve"> Cited 0 times. IF=1.8/Q3. Points=40.</w:t>
       </w:r>
     </w:p>
     <w:p>
@@ -438,7 +438,7 @@
           <w:b/>
           <w:sz w:val="22"/>
         </w:rPr>
-        <w:t xml:space="preserve"> Cited 4 times. IF=6.7/Q1.</w:t>
+        <w:t xml:space="preserve"> Cited 4 times. IF=6.7/Q1. Points=20.</w:t>
       </w:r>
     </w:p>
     <w:p>
@@ -474,7 +474,7 @@
           <w:b/>
           <w:sz w:val="22"/>
         </w:rPr>
-        <w:t xml:space="preserve"> Cited 0 times. IF=0.8/Q3.</w:t>
+        <w:t xml:space="preserve"> Cited 0 times. IF=0.8/Q3. Points=70.</w:t>
       </w:r>
     </w:p>
     <w:p>
@@ -492,7 +492,7 @@
           <w:b/>
           <w:sz w:val="22"/>
         </w:rPr>
-        <w:t xml:space="preserve"> Cited 3 times. IF=6.7/Q1.</w:t>
+        <w:t xml:space="preserve"> Cited 3 times. IF=6.7/Q1. Points=20.</w:t>
       </w:r>
     </w:p>
     <w:p>
@@ -510,7 +510,7 @@
           <w:b/>
           <w:sz w:val="22"/>
         </w:rPr>
-        <w:t xml:space="preserve"> Cited 5 times. IF=6.7/Q1.</w:t>
+        <w:t xml:space="preserve"> Cited 5 times. IF=6.7/Q1. Points=20.</w:t>
       </w:r>
     </w:p>
     <w:p>
@@ -528,7 +528,7 @@
           <w:b/>
           <w:sz w:val="22"/>
         </w:rPr>
-        <w:t xml:space="preserve"> Cited 2 times. IF=3.9/Q1.</w:t>
+        <w:t xml:space="preserve"> Cited 2 times. IF=3.9/Q1. Points=20.</w:t>
       </w:r>
     </w:p>
     <w:p>
@@ -546,7 +546,7 @@
           <w:b/>
           <w:sz w:val="22"/>
         </w:rPr>
-        <w:t xml:space="preserve"> Cited 2 times. IF=3.9/Q1.</w:t>
+        <w:t xml:space="preserve"> Cited 2 times. IF=3.9/Q1. Points=20.</w:t>
       </w:r>
     </w:p>
     <w:p>
@@ -564,7 +564,7 @@
           <w:b/>
           <w:sz w:val="22"/>
         </w:rPr>
-        <w:t xml:space="preserve"> Cited 11 times. IF=5.8/Q1.</w:t>
+        <w:t xml:space="preserve"> Cited 11 times. IF=5.8/Q1. Points=140.</w:t>
       </w:r>
     </w:p>
     <w:p>
@@ -582,7 +582,7 @@
           <w:b/>
           <w:sz w:val="22"/>
         </w:rPr>
-        <w:t xml:space="preserve"> Cited 20 times. IF=14.1/Q1.</w:t>
+        <w:t xml:space="preserve"> Cited 20 times. IF=14.1/Q1. Points=200.</w:t>
       </w:r>
     </w:p>
     <w:p>
@@ -600,7 +600,7 @@
           <w:b/>
           <w:sz w:val="22"/>
         </w:rPr>
-        <w:t xml:space="preserve"> Cited 0 times. IF=1.1/Q3.</w:t>
+        <w:t xml:space="preserve"> Cited 0 times. IF=1.1/Q3. Points=100.</w:t>
       </w:r>
     </w:p>
     <w:p>
@@ -618,7 +618,7 @@
           <w:b/>
           <w:sz w:val="22"/>
         </w:rPr>
-        <w:t xml:space="preserve"> Cited 3 times. IF=1.5/Q3.</w:t>
+        <w:t xml:space="preserve"> Cited 3 times. IF=1.5/Q3. Points=140.</w:t>
       </w:r>
     </w:p>
     <w:p>
@@ -636,7 +636,7 @@
           <w:b/>
           <w:sz w:val="22"/>
         </w:rPr>
-        <w:t xml:space="preserve"> Cited 17 times. IF=2.6/Q3.</w:t>
+        <w:t xml:space="preserve"> Cited 17 times. IF=2.6/Q3. Points=100.</w:t>
       </w:r>
     </w:p>
     <w:p>
@@ -654,7 +654,7 @@
           <w:b/>
           <w:sz w:val="22"/>
         </w:rPr>
-        <w:t xml:space="preserve"> Cited 1 times. IF=4.9/Q1.</w:t>
+        <w:t xml:space="preserve"> Cited 1 times. IF=4.9/Q1. Points=140.</w:t>
       </w:r>
     </w:p>
     <w:p>
@@ -672,7 +672,7 @@
           <w:b/>
           <w:sz w:val="22"/>
         </w:rPr>
-        <w:t xml:space="preserve"> Cited 5 times. IF=6.7/Q1.</w:t>
+        <w:t xml:space="preserve"> Cited 5 times. IF=6.7/Q1. Points=20.</w:t>
       </w:r>
     </w:p>
     <w:p>
@@ -708,7 +708,7 @@
           <w:b/>
           <w:sz w:val="22"/>
         </w:rPr>
-        <w:t xml:space="preserve"> Cited 6 times. IF=10.4/Q1.</w:t>
+        <w:t xml:space="preserve"> Cited 6 times. IF=10.4/Q1. Points=200.</w:t>
       </w:r>
     </w:p>
     <w:p>
@@ -726,7 +726,7 @@
           <w:b/>
           <w:sz w:val="22"/>
         </w:rPr>
-        <w:t xml:space="preserve"> Cited 12 times. IF=4.3/Q1.</w:t>
+        <w:t xml:space="preserve"> Cited 12 times. IF=4.3/Q1. Points=100.</w:t>
       </w:r>
     </w:p>
     <w:p>
@@ -744,7 +744,7 @@
           <w:b/>
           <w:sz w:val="22"/>
         </w:rPr>
-        <w:t xml:space="preserve"> Cited 2 times. IF=1.3/Q4.</w:t>
+        <w:t xml:space="preserve"> Cited 2 times. IF=1.3/Q4. Points=20.</w:t>
       </w:r>
     </w:p>
     <w:p>
@@ -762,7 +762,7 @@
           <w:b/>
           <w:sz w:val="22"/>
         </w:rPr>
-        <w:t xml:space="preserve"> Cited 2 times. IF=6.7/Q1.</w:t>
+        <w:t xml:space="preserve"> Cited 2 times. IF=6.7/Q1. Points=20.</w:t>
       </w:r>
     </w:p>
     <w:p>
@@ -780,7 +780,7 @@
           <w:b/>
           <w:sz w:val="22"/>
         </w:rPr>
-        <w:t xml:space="preserve"> Cited 1 times. IF=4.1/Q2.</w:t>
+        <w:t xml:space="preserve"> Cited 1 times. IF=4.1/Q2. Points=70.</w:t>
       </w:r>
     </w:p>
     <w:p>
@@ -798,7 +798,7 @@
           <w:b/>
           <w:sz w:val="22"/>
         </w:rPr>
-        <w:t xml:space="preserve"> Cited 5 times. IF=5.4/Q1.</w:t>
+        <w:t xml:space="preserve"> Cited 5 times. IF=5.4/Q1. Points=100.</w:t>
       </w:r>
     </w:p>
     <w:p>
@@ -816,7 +816,7 @@
           <w:b/>
           <w:sz w:val="22"/>
         </w:rPr>
-        <w:t xml:space="preserve"> Cited 0 times. IF=5.2/Q1.</w:t>
+        <w:t xml:space="preserve"> Cited 0 times. IF=5.2/Q1. Points=20.</w:t>
       </w:r>
     </w:p>
     <w:p>
@@ -834,7 +834,7 @@
           <w:b/>
           <w:sz w:val="22"/>
         </w:rPr>
-        <w:t xml:space="preserve"> Cited 0 times. IF=2.5/Q3.</w:t>
+        <w:t xml:space="preserve"> Cited 0 times. IF=2.5/Q3. Points=70.</w:t>
       </w:r>
     </w:p>
     <w:p>
@@ -852,7 +852,7 @@
           <w:b/>
           <w:sz w:val="22"/>
         </w:rPr>
-        <w:t xml:space="preserve"> Cited 0 times. IF=1.9/Q2.</w:t>
+        <w:t xml:space="preserve"> Cited 0 times. IF=1.9/Q2. Points=100.</w:t>
       </w:r>
     </w:p>
     <w:p>
@@ -878,7 +878,7 @@
           <w:b/>
           <w:sz w:val="22"/>
         </w:rPr>
-        <w:t xml:space="preserve"> Cited 13 times. IF=1.1/Q3.</w:t>
+        <w:t xml:space="preserve"> Cited 13 times. IF=1.1/Q3. Points=100.</w:t>
       </w:r>
     </w:p>
     <w:p>
@@ -896,7 +896,7 @@
           <w:b/>
           <w:sz w:val="22"/>
         </w:rPr>
-        <w:t xml:space="preserve"> Cited 20 times. IF=8.3/Q1.</w:t>
+        <w:t xml:space="preserve"> Cited 20 times. IF=8.3/Q1. Points=140.</w:t>
       </w:r>
     </w:p>
     <w:p>
@@ -914,7 +914,7 @@
           <w:b/>
           <w:sz w:val="22"/>
         </w:rPr>
-        <w:t xml:space="preserve"> Cited 10 times. IF=1.1/Q3.</w:t>
+        <w:t xml:space="preserve"> Cited 10 times. IF=1.1/Q3. Points=100.</w:t>
       </w:r>
     </w:p>
     <w:p>
@@ -932,7 +932,7 @@
           <w:b/>
           <w:sz w:val="22"/>
         </w:rPr>
-        <w:t xml:space="preserve"> Cited 1 times. IF=1.1/Q3.</w:t>
+        <w:t xml:space="preserve"> Cited 1 times. IF=1.1/Q3. Points=100.</w:t>
       </w:r>
     </w:p>
     <w:p>
@@ -950,7 +950,7 @@
           <w:b/>
           <w:sz w:val="22"/>
         </w:rPr>
-        <w:t xml:space="preserve"> Cited 3 times. IF=2.6/Q1.</w:t>
+        <w:t xml:space="preserve"> Cited 3 times. IF=2.6/Q1. Points=100.</w:t>
       </w:r>
     </w:p>
     <w:p>
@@ -968,7 +968,7 @@
           <w:b/>
           <w:sz w:val="22"/>
         </w:rPr>
-        <w:t xml:space="preserve"> Cited 1 times. IF=3.9/Q1.</w:t>
+        <w:t xml:space="preserve"> Cited 1 times. IF=3.9/Q1. Points=20.</w:t>
       </w:r>
     </w:p>
     <w:p>
@@ -986,7 +986,7 @@
           <w:b/>
           <w:sz w:val="22"/>
         </w:rPr>
-        <w:t xml:space="preserve"> Cited 5 times. IF=6.7/Q1.</w:t>
+        <w:t xml:space="preserve"> Cited 5 times. IF=6.7/Q1. Points=20.</w:t>
       </w:r>
     </w:p>
     <w:p>
@@ -1004,7 +1004,7 @@
           <w:b/>
           <w:sz w:val="22"/>
         </w:rPr>
-        <w:t xml:space="preserve"> Cited 12 times. IF=5.7/Q1.</w:t>
+        <w:t xml:space="preserve"> Cited 12 times. IF=5.7/Q1. Points=100.</w:t>
       </w:r>
     </w:p>
     <w:p>
@@ -1022,7 +1022,7 @@
           <w:b/>
           <w:sz w:val="22"/>
         </w:rPr>
-        <w:t xml:space="preserve"> Cited 1 times. IF=1.1/Q3.</w:t>
+        <w:t xml:space="preserve"> Cited 1 times. IF=1.1/Q3. Points=100.</w:t>
       </w:r>
     </w:p>
     <w:p>
@@ -1040,7 +1040,7 @@
           <w:b/>
           <w:sz w:val="22"/>
         </w:rPr>
-        <w:t xml:space="preserve"> Cited 2 times. IF=3.4/Q1.</w:t>
+        <w:t xml:space="preserve"> Cited 2 times. IF=3.4/Q1. Points=20.</w:t>
       </w:r>
     </w:p>
     <w:p>
@@ -1058,7 +1058,7 @@
           <w:b/>
           <w:sz w:val="22"/>
         </w:rPr>
-        <w:t xml:space="preserve"> Cited 4 times. IF=6.7/Q1.</w:t>
+        <w:t xml:space="preserve"> Cited 4 times. IF=6.7/Q1. Points=20.</w:t>
       </w:r>
     </w:p>
     <w:p>
@@ -1076,7 +1076,7 @@
           <w:b/>
           <w:sz w:val="22"/>
         </w:rPr>
-        <w:t xml:space="preserve"> Cited 4 times. IF=1.8/Q2.</w:t>
+        <w:t xml:space="preserve"> Cited 4 times. IF=1.8/Q2. Points=140.</w:t>
       </w:r>
     </w:p>
     <w:p>
@@ -1094,7 +1094,7 @@
           <w:b/>
           <w:sz w:val="22"/>
         </w:rPr>
-        <w:t xml:space="preserve"> Cited 5 times. IF=2/Q3.</w:t>
+        <w:t xml:space="preserve"> Cited 5 times. IF=2/Q3. Points=70.</w:t>
       </w:r>
     </w:p>
     <w:p>
@@ -1112,7 +1112,7 @@
           <w:b/>
           <w:sz w:val="22"/>
         </w:rPr>
-        <w:t xml:space="preserve"> Cited 4 times. IF=4.1/Q2.</w:t>
+        <w:t xml:space="preserve"> Cited 4 times. IF=4.1/Q2. Points=70.</w:t>
       </w:r>
     </w:p>
     <w:p>
@@ -1148,7 +1148,7 @@
           <w:b/>
           <w:sz w:val="22"/>
         </w:rPr>
-        <w:t xml:space="preserve"> Cited 17 times. IF=3.6/Q1.</w:t>
+        <w:t xml:space="preserve"> Cited 17 times. IF=3.6/Q1. Points=70.</w:t>
       </w:r>
     </w:p>
     <w:p>
@@ -1166,7 +1166,7 @@
           <w:b/>
           <w:sz w:val="22"/>
         </w:rPr>
-        <w:t xml:space="preserve"> Cited 22 times. IF=6.7/Q1.</w:t>
+        <w:t xml:space="preserve"> Cited 22 times. IF=6.7/Q1. Points=20.</w:t>
       </w:r>
     </w:p>
     <w:p>
@@ -1184,7 +1184,7 @@
           <w:b/>
           <w:sz w:val="22"/>
         </w:rPr>
-        <w:t xml:space="preserve"> Cited 5 times. IF=4.1/Q1.</w:t>
+        <w:t xml:space="preserve"> Cited 5 times. IF=4.1/Q1. Points=100.</w:t>
       </w:r>
     </w:p>
     <w:p>
@@ -1202,7 +1202,7 @@
           <w:b/>
           <w:sz w:val="22"/>
         </w:rPr>
-        <w:t xml:space="preserve"> Cited 6 times. IF=6.7/Q1.</w:t>
+        <w:t xml:space="preserve"> Cited 6 times. IF=6.7/Q1. Points=20.</w:t>
       </w:r>
     </w:p>
     <w:p>
@@ -1220,7 +1220,7 @@
           <w:b/>
           <w:sz w:val="22"/>
         </w:rPr>
-        <w:t xml:space="preserve"> Cited 2 times. IF=4.1/Q2.</w:t>
+        <w:t xml:space="preserve"> Cited 2 times. IF=4.1/Q2. Points=70.</w:t>
       </w:r>
     </w:p>
     <w:p>
@@ -1238,7 +1238,7 @@
           <w:b/>
           <w:sz w:val="22"/>
         </w:rPr>
-        <w:t xml:space="preserve"> Cited 5 times. IF=9/Q1.</w:t>
+        <w:t xml:space="preserve"> Cited 5 times. IF=9/Q1. Points=140.</w:t>
       </w:r>
     </w:p>
     <w:p>
@@ -1256,7 +1256,7 @@
           <w:b/>
           <w:sz w:val="22"/>
         </w:rPr>
-        <w:t xml:space="preserve"> Cited 27 times. IF=5.6/Q1.</w:t>
+        <w:t xml:space="preserve"> Cited 27 times. IF=5.6/Q1. Points=100.</w:t>
       </w:r>
     </w:p>
     <w:p>
@@ -1274,7 +1274,7 @@
           <w:b/>
           <w:sz w:val="22"/>
         </w:rPr>
-        <w:t xml:space="preserve"> Cited 19 times. IF=44.5/Q1.</w:t>
+        <w:t xml:space="preserve"> Cited 19 times. IF=44.5/Q1. Points=200.</w:t>
       </w:r>
     </w:p>
     <w:p>
@@ -1292,7 +1292,7 @@
           <w:b/>
           <w:sz w:val="22"/>
         </w:rPr>
-        <w:t xml:space="preserve"> Cited 1 times. IF=1.1/Q3.</w:t>
+        <w:t xml:space="preserve"> Cited 1 times. IF=1.1/Q3. Points=100.</w:t>
       </w:r>
     </w:p>
     <w:p>
@@ -1310,7 +1310,7 @@
           <w:b/>
           <w:sz w:val="22"/>
         </w:rPr>
-        <w:t xml:space="preserve"> Cited 7 times. IF=6.7/Q1.</w:t>
+        <w:t xml:space="preserve"> Cited 7 times. IF=6.7/Q1. Points=20.</w:t>
       </w:r>
     </w:p>
     <w:p>
@@ -1328,7 +1328,7 @@
           <w:b/>
           <w:sz w:val="22"/>
         </w:rPr>
-        <w:t xml:space="preserve"> Cited 17 times. IF=5.8/Q1.</w:t>
+        <w:t xml:space="preserve"> Cited 17 times. IF=5.8/Q1. Points=140.</w:t>
       </w:r>
     </w:p>
     <w:p>
@@ -1346,7 +1346,7 @@
           <w:b/>
           <w:sz w:val="22"/>
         </w:rPr>
-        <w:t xml:space="preserve"> Cited 2 times. IF=5.4/Q1.</w:t>
+        <w:t xml:space="preserve"> Cited 2 times. IF=5.4/Q1. Points=100.</w:t>
       </w:r>
     </w:p>
     <w:p>
@@ -1364,7 +1364,7 @@
           <w:b/>
           <w:sz w:val="22"/>
         </w:rPr>
-        <w:t xml:space="preserve"> Cited 2 times. IF=4.1/Q1.</w:t>
+        <w:t xml:space="preserve"> Cited 2 times. IF=4.1/Q1. Points=100.</w:t>
       </w:r>
     </w:p>
     <w:p>
@@ -1382,7 +1382,7 @@
           <w:b/>
           <w:sz w:val="22"/>
         </w:rPr>
-        <w:t xml:space="preserve"> Cited 8 times. IF=2.1/Q2.</w:t>
+        <w:t xml:space="preserve"> Cited 8 times. IF=2.1/Q2. Points=100.</w:t>
       </w:r>
     </w:p>
     <w:p>
@@ -1400,7 +1400,7 @@
           <w:b/>
           <w:sz w:val="22"/>
         </w:rPr>
-        <w:t xml:space="preserve"> Cited 76 times. IF=5.1/Q2.</w:t>
+        <w:t xml:space="preserve"> Cited 76 times. IF=5.1/Q2. Points=140.</w:t>
       </w:r>
     </w:p>
     <w:p>
@@ -1436,7 +1436,7 @@
           <w:b/>
           <w:sz w:val="22"/>
         </w:rPr>
-        <w:t xml:space="preserve"> Cited 1 times. IF=2.7/Q3.</w:t>
+        <w:t xml:space="preserve"> Cited 1 times. IF=2.7/Q3. Points=100.</w:t>
       </w:r>
     </w:p>
     <w:p>
@@ -1454,7 +1454,7 @@
           <w:b/>
           <w:sz w:val="22"/>
         </w:rPr>
-        <w:t xml:space="preserve"> Cited 19 times. IF=3.4/Q2.</w:t>
+        <w:t xml:space="preserve"> Cited 19 times. IF=3.4/Q2. Points=100.</w:t>
       </w:r>
     </w:p>
     <w:p>
@@ -1480,7 +1480,7 @@
           <w:b/>
           <w:sz w:val="22"/>
         </w:rPr>
-        <w:t xml:space="preserve"> Cited 2 times. IF=2.7/Q1.</w:t>
+        <w:t xml:space="preserve"> Cited 2 times. IF=2.7/Q1. Points=20.</w:t>
       </w:r>
     </w:p>
     <w:p>
@@ -1498,7 +1498,7 @@
           <w:b/>
           <w:sz w:val="22"/>
         </w:rPr>
-        <w:t xml:space="preserve"> Cited 1 times. IF=2.1/Q2.</w:t>
+        <w:t xml:space="preserve"> Cited 1 times. IF=2.1/Q2. Points=100.</w:t>
       </w:r>
     </w:p>
     <w:p>
@@ -1516,7 +1516,7 @@
           <w:b/>
           <w:sz w:val="22"/>
         </w:rPr>
-        <w:t xml:space="preserve"> Cited 1 times. IF=5.4/Q1.</w:t>
+        <w:t xml:space="preserve"> Cited 1 times. IF=5.4/Q1. Points=100.</w:t>
       </w:r>
     </w:p>
     <w:p>
@@ -1534,7 +1534,7 @@
           <w:b/>
           <w:sz w:val="22"/>
         </w:rPr>
-        <w:t xml:space="preserve"> Cited 2 times. IF=3.4/Q1.</w:t>
+        <w:t xml:space="preserve"> Cited 2 times. IF=3.4/Q1. Points=40.</w:t>
       </w:r>
     </w:p>
     <w:p>
@@ -1570,7 +1570,7 @@
           <w:b/>
           <w:sz w:val="22"/>
         </w:rPr>
-        <w:t xml:space="preserve"> Cited 13 times. IF=5.2/Q1.</w:t>
+        <w:t xml:space="preserve"> Cited 13 times. IF=5.2/Q1. Points=70.</w:t>
       </w:r>
     </w:p>
     <w:p>
@@ -1588,7 +1588,7 @@
           <w:b/>
           <w:sz w:val="22"/>
         </w:rPr>
-        <w:t xml:space="preserve"> Cited 11 times. IF=4.1/Q1.</w:t>
+        <w:t xml:space="preserve"> Cited 11 times. IF=4.1/Q1. Points=100.</w:t>
       </w:r>
     </w:p>
     <w:p>
@@ -1606,7 +1606,7 @@
           <w:b/>
           <w:sz w:val="22"/>
         </w:rPr>
-        <w:t xml:space="preserve"> Cited 1 times. IF=3.7/Q2.</w:t>
+        <w:t xml:space="preserve"> Cited 1 times. IF=3.7/Q2. Points=70.</w:t>
       </w:r>
     </w:p>
     <w:p>
@@ -1624,7 +1624,7 @@
           <w:b/>
           <w:sz w:val="22"/>
         </w:rPr>
-        <w:t xml:space="preserve"> Cited 23 times. IF=8.2/Q1.</w:t>
+        <w:t xml:space="preserve"> Cited 23 times. IF=8.2/Q1. Points=100.</w:t>
       </w:r>
     </w:p>
     <w:p>
@@ -1642,7 +1642,7 @@
           <w:b/>
           <w:sz w:val="22"/>
         </w:rPr>
-        <w:t xml:space="preserve"> Cited 7 times. IF=6.7/Q1.</w:t>
+        <w:t xml:space="preserve"> Cited 7 times. IF=6.7/Q1. Points=140.</w:t>
       </w:r>
     </w:p>
     <w:p>
@@ -1660,7 +1660,7 @@
           <w:b/>
           <w:sz w:val="22"/>
         </w:rPr>
-        <w:t xml:space="preserve"> Cited 22 times. IF=5.6/Q1.</w:t>
+        <w:t xml:space="preserve"> Cited 22 times. IF=5.6/Q1. Points=140.</w:t>
       </w:r>
     </w:p>
     <w:p>
@@ -1678,7 +1678,7 @@
           <w:b/>
           <w:sz w:val="22"/>
         </w:rPr>
-        <w:t xml:space="preserve"> Cited 7 times. IF=5.4/Q1.</w:t>
+        <w:t xml:space="preserve"> Cited 7 times. IF=5.4/Q1. Points=100.</w:t>
       </w:r>
     </w:p>
     <w:p>
@@ -1696,7 +1696,7 @@
           <w:b/>
           <w:sz w:val="22"/>
         </w:rPr>
-        <w:t xml:space="preserve"> Cited 11 times. IF=5.6/Q1.</w:t>
+        <w:t xml:space="preserve"> Cited 11 times. IF=5.6/Q1. Points=140.</w:t>
       </w:r>
     </w:p>
     <w:p>
@@ -1714,7 +1714,7 @@
           <w:b/>
           <w:sz w:val="22"/>
         </w:rPr>
-        <w:t xml:space="preserve"> Cited 122 times. IF=9.4/Q1.</w:t>
+        <w:t xml:space="preserve"> Cited 122 times. IF=9.4/Q1. Points=20.</w:t>
       </w:r>
     </w:p>
     <w:p>
@@ -1732,7 +1732,7 @@
           <w:b/>
           <w:sz w:val="22"/>
         </w:rPr>
-        <w:t xml:space="preserve"> Cited 5 times. IF=3.5/Q2.</w:t>
+        <w:t xml:space="preserve"> Cited 5 times. IF=3.5/Q2. Points=20.</w:t>
       </w:r>
     </w:p>
     <w:p>
@@ -1750,7 +1750,7 @@
           <w:b/>
           <w:sz w:val="22"/>
         </w:rPr>
-        <w:t xml:space="preserve"> Cited 3 times. IF=2.2/Q3.</w:t>
+        <w:t xml:space="preserve"> Cited 3 times. IF=2.2/Q3. Points=40.</w:t>
       </w:r>
     </w:p>
     <w:p>
@@ -1768,7 +1768,7 @@
           <w:b/>
           <w:sz w:val="22"/>
         </w:rPr>
-        <w:t xml:space="preserve"> Cited 5 times. IF=4.1/Q1.</w:t>
+        <w:t xml:space="preserve"> Cited 5 times. IF=4.1/Q1. Points=100.</w:t>
       </w:r>
     </w:p>
     <w:p>
@@ -1786,7 +1786,7 @@
           <w:b/>
           <w:sz w:val="22"/>
         </w:rPr>
-        <w:t xml:space="preserve"> Cited 9 times. IF=3.9/Q1.</w:t>
+        <w:t xml:space="preserve"> Cited 9 times. IF=3.9/Q1. Points=20.</w:t>
       </w:r>
     </w:p>
     <w:p>
@@ -1804,7 +1804,7 @@
           <w:b/>
           <w:sz w:val="22"/>
         </w:rPr>
-        <w:t xml:space="preserve"> Cited 8 times. IF=3.6/Q1.</w:t>
+        <w:t xml:space="preserve"> Cited 8 times. IF=3.6/Q1. Points=70.</w:t>
       </w:r>
     </w:p>
     <w:p>
@@ -1822,7 +1822,7 @@
           <w:b/>
           <w:sz w:val="22"/>
         </w:rPr>
-        <w:t xml:space="preserve"> Cited 174 times. IF=4.1/Q1.</w:t>
+        <w:t xml:space="preserve"> Cited 174 times. IF=4.1/Q1. Points=100.</w:t>
       </w:r>
     </w:p>
     <w:p>
@@ -1840,7 +1840,7 @@
           <w:b/>
           <w:sz w:val="22"/>
         </w:rPr>
-        <w:t xml:space="preserve"> Cited 6 times. IF=4.1/Q1.</w:t>
+        <w:t xml:space="preserve"> Cited 6 times. IF=4.1/Q1. Points=100.</w:t>
       </w:r>
     </w:p>
     <w:p>
@@ -1858,7 +1858,7 @@
           <w:b/>
           <w:sz w:val="22"/>
         </w:rPr>
-        <w:t xml:space="preserve"> Cited 3 times. IF=4.1/Q1.</w:t>
+        <w:t xml:space="preserve"> Cited 3 times. IF=4.1/Q1. Points=100.</w:t>
       </w:r>
     </w:p>
     <w:p>
@@ -1876,7 +1876,7 @@
           <w:b/>
           <w:sz w:val="22"/>
         </w:rPr>
-        <w:t xml:space="preserve"> Cited 12 times. IF=4.1/Q1.</w:t>
+        <w:t xml:space="preserve"> Cited 12 times. IF=4.1/Q1. Points=100.</w:t>
       </w:r>
     </w:p>
     <w:p>
@@ -1894,7 +1894,7 @@
           <w:b/>
           <w:sz w:val="22"/>
         </w:rPr>
-        <w:t xml:space="preserve"> Cited 23 times. IF=4.1/Q1.</w:t>
+        <w:t xml:space="preserve"> Cited 23 times. IF=4.1/Q1. Points=100.</w:t>
       </w:r>
     </w:p>
     <w:p>
@@ -1912,7 +1912,7 @@
           <w:b/>
           <w:sz w:val="22"/>
         </w:rPr>
-        <w:t xml:space="preserve"> Cited 8 times. IF=1.1/Q3.</w:t>
+        <w:t xml:space="preserve"> Cited 8 times. IF=1.1/Q3. Points=100.</w:t>
       </w:r>
     </w:p>
     <w:p>
@@ -1930,7 +1930,7 @@
           <w:b/>
           <w:sz w:val="22"/>
         </w:rPr>
-        <w:t xml:space="preserve"> Cited 19 times. IF=7/Q1.</w:t>
+        <w:t xml:space="preserve"> Cited 19 times. IF=7/Q1. Points=140.</w:t>
       </w:r>
     </w:p>
     <w:p>
@@ -1948,7 +1948,7 @@
           <w:b/>
           <w:sz w:val="22"/>
         </w:rPr>
-        <w:t xml:space="preserve"> Cited 59 times. IF=11.3/Q1.</w:t>
+        <w:t xml:space="preserve"> Cited 59 times. IF=11.3/Q1. Points=140.</w:t>
       </w:r>
     </w:p>
     <w:p>
@@ -1966,7 +1966,7 @@
           <w:b/>
           <w:sz w:val="22"/>
         </w:rPr>
-        <w:t xml:space="preserve"> Cited 5 times.</w:t>
+        <w:t xml:space="preserve"> Cited 5 times. Points=20.</w:t>
       </w:r>
     </w:p>
     <w:p>
@@ -1992,7 +1992,7 @@
           <w:b/>
           <w:sz w:val="22"/>
         </w:rPr>
-        <w:t xml:space="preserve"> Cited 1 times. IF=0.2/Q4.</w:t>
+        <w:t xml:space="preserve"> Cited 1 times. IF=0.2/Q4. Points=20.</w:t>
       </w:r>
     </w:p>
     <w:p>
@@ -2010,7 +2010,7 @@
           <w:b/>
           <w:sz w:val="22"/>
         </w:rPr>
-        <w:t xml:space="preserve"> Cited 4 times. IF=3.6/Q1.</w:t>
+        <w:t xml:space="preserve"> Cited 4 times. IF=3.6/Q1. Points=70.</w:t>
       </w:r>
     </w:p>
     <w:p>
@@ -2028,7 +2028,7 @@
           <w:b/>
           <w:sz w:val="22"/>
         </w:rPr>
-        <w:t xml:space="preserve"> Cited 10 times. IF=1.7/Q3.</w:t>
+        <w:t xml:space="preserve"> Cited 10 times. IF=1.7/Q3. Points=100.</w:t>
       </w:r>
     </w:p>
     <w:p>
@@ -2046,7 +2046,7 @@
           <w:b/>
           <w:sz w:val="22"/>
         </w:rPr>
-        <w:t xml:space="preserve"> Cited 41 times. IF=20.3/Q1.</w:t>
+        <w:t xml:space="preserve"> Cited 41 times. IF=20.3/Q1. Points=140.</w:t>
       </w:r>
     </w:p>
     <w:p>
@@ -2064,7 +2064,7 @@
           <w:b/>
           <w:sz w:val="22"/>
         </w:rPr>
-        <w:t xml:space="preserve"> Cited 9 times. IF=5.4/Q1.</w:t>
+        <w:t xml:space="preserve"> Cited 9 times. IF=5.4/Q1. Points=100.</w:t>
       </w:r>
     </w:p>
     <w:p>
@@ -2082,7 +2082,7 @@
           <w:b/>
           <w:sz w:val="22"/>
         </w:rPr>
-        <w:t xml:space="preserve"> Cited 27 times. IF=3.2/Q2.</w:t>
+        <w:t xml:space="preserve"> Cited 27 times. IF=3.2/Q2. Points=100.</w:t>
       </w:r>
     </w:p>
     <w:p>
@@ -2100,7 +2100,7 @@
           <w:b/>
           <w:sz w:val="22"/>
         </w:rPr>
-        <w:t xml:space="preserve"> Cited 187 times. IF=12.2/Q1.</w:t>
+        <w:t xml:space="preserve"> Cited 187 times. IF=12.2/Q1. Points=100.</w:t>
       </w:r>
     </w:p>
     <w:p>
@@ -2118,7 +2118,7 @@
           <w:b/>
           <w:sz w:val="22"/>
         </w:rPr>
-        <w:t xml:space="preserve"> Cited 158 times. IF=8.2/Q1.</w:t>
+        <w:t xml:space="preserve"> Cited 158 times. IF=8.2/Q1. Points=140.</w:t>
       </w:r>
     </w:p>
     <w:p>
@@ -2136,7 +2136,7 @@
           <w:b/>
           <w:sz w:val="22"/>
         </w:rPr>
-        <w:t xml:space="preserve"> Cited 39 times. IF=8.2/Q1.</w:t>
+        <w:t xml:space="preserve"> Cited 39 times. IF=8.2/Q1. Points=140.</w:t>
       </w:r>
     </w:p>
     <w:p>
@@ -2154,7 +2154,7 @@
           <w:b/>
           <w:sz w:val="22"/>
         </w:rPr>
-        <w:t xml:space="preserve"> Cited 14 times. IF=2.4/Q3.</w:t>
+        <w:t xml:space="preserve"> Cited 14 times. IF=2.4/Q3. Points=70.</w:t>
       </w:r>
     </w:p>
     <w:p>
@@ -2172,7 +2172,7 @@
           <w:b/>
           <w:sz w:val="22"/>
         </w:rPr>
-        <w:t xml:space="preserve"> Cited 31 times. IF=13.9/Q1.</w:t>
+        <w:t xml:space="preserve"> Cited 31 times. IF=13.9/Q1. Points=20.</w:t>
       </w:r>
     </w:p>
     <w:p>
@@ -2190,7 +2190,7 @@
           <w:b/>
           <w:sz w:val="22"/>
         </w:rPr>
-        <w:t xml:space="preserve"> Cited 24 times. IF=1.1/Q3.</w:t>
+        <w:t xml:space="preserve"> Cited 24 times. IF=1.1/Q3. Points=100.</w:t>
       </w:r>
     </w:p>
     <w:p>
@@ -2208,7 +2208,7 @@
           <w:b/>
           <w:sz w:val="22"/>
         </w:rPr>
-        <w:t xml:space="preserve"> Cited 16 times. IF=3.4/Q2.</w:t>
+        <w:t xml:space="preserve"> Cited 16 times. IF=3.4/Q2. Points=100.</w:t>
       </w:r>
     </w:p>
     <w:p>
@@ -2226,7 +2226,7 @@
           <w:b/>
           <w:sz w:val="22"/>
         </w:rPr>
-        <w:t xml:space="preserve"> Cited 1 times. IF=1.1/Q3.</w:t>
+        <w:t xml:space="preserve"> Cited 1 times. IF=1.1/Q3. Points=100.</w:t>
       </w:r>
     </w:p>
     <w:p>
@@ -2244,7 +2244,7 @@
           <w:b/>
           <w:sz w:val="22"/>
         </w:rPr>
-        <w:t xml:space="preserve"> Cited 44 times. IF=5.7/Q1.</w:t>
+        <w:t xml:space="preserve"> Cited 44 times. IF=5.7/Q1. Points=100.</w:t>
       </w:r>
     </w:p>
     <w:p>
@@ -2262,7 +2262,7 @@
           <w:b/>
           <w:sz w:val="22"/>
         </w:rPr>
-        <w:t xml:space="preserve"> Cited 15 times. IF=7.3/Q1.</w:t>
+        <w:t xml:space="preserve"> Cited 15 times. IF=7.3/Q1. Points=100.</w:t>
       </w:r>
     </w:p>
     <w:p>
@@ -2280,7 +2280,7 @@
           <w:b/>
           <w:sz w:val="22"/>
         </w:rPr>
-        <w:t xml:space="preserve"> Cited 15 times. IF=4.1/Q1.</w:t>
+        <w:t xml:space="preserve"> Cited 15 times. IF=4.1/Q1. Points=100.</w:t>
       </w:r>
     </w:p>
     <w:p>
@@ -2298,7 +2298,7 @@
           <w:b/>
           <w:sz w:val="22"/>
         </w:rPr>
-        <w:t xml:space="preserve"> Cited 3 times. IF=2.4/Q2.</w:t>
+        <w:t xml:space="preserve"> Cited 3 times. IF=2.4/Q2. Points=20.</w:t>
       </w:r>
     </w:p>
     <w:p>
@@ -2316,7 +2316,7 @@
           <w:b/>
           <w:sz w:val="22"/>
         </w:rPr>
-        <w:t xml:space="preserve"> Cited 13 times. IF=4/Q2.</w:t>
+        <w:t xml:space="preserve"> Cited 13 times. IF=4/Q2. Points=70.</w:t>
       </w:r>
     </w:p>
     <w:p>
@@ -2334,7 +2334,7 @@
           <w:b/>
           <w:sz w:val="22"/>
         </w:rPr>
-        <w:t xml:space="preserve"> Cited 8 times. IF=4.5/Q2.</w:t>
+        <w:t xml:space="preserve"> Cited 8 times. IF=4.5/Q2. Points=100.</w:t>
       </w:r>
     </w:p>
     <w:p>
@@ -2352,7 +2352,7 @@
           <w:b/>
           <w:sz w:val="22"/>
         </w:rPr>
-        <w:t xml:space="preserve"> Cited 17 times.</w:t>
+        <w:t xml:space="preserve"> Cited 17 times. Points=70.</w:t>
       </w:r>
     </w:p>
     <w:p>
@@ -2370,7 +2370,7 @@
           <w:b/>
           <w:sz w:val="22"/>
         </w:rPr>
-        <w:t xml:space="preserve"> Cited 3 times.</w:t>
+        <w:t xml:space="preserve"> Cited 3 times. Points=20.</w:t>
       </w:r>
     </w:p>
     <w:p>
@@ -2388,7 +2388,7 @@
           <w:b/>
           <w:sz w:val="22"/>
         </w:rPr>
-        <w:t xml:space="preserve"> Cited 141 times. IF=12.2/Q1.</w:t>
+        <w:t xml:space="preserve"> Cited 141 times. IF=12.2/Q1. Points=100.</w:t>
       </w:r>
     </w:p>
     <w:p>
@@ -2406,7 +2406,7 @@
           <w:b/>
           <w:sz w:val="22"/>
         </w:rPr>
-        <w:t xml:space="preserve"> Cited 16 times. IF=5.6/Q1.</w:t>
+        <w:t xml:space="preserve"> Cited 16 times. IF=5.6/Q1. Points=140.</w:t>
       </w:r>
     </w:p>
     <w:p>
@@ -2424,7 +2424,7 @@
           <w:b/>
           <w:sz w:val="22"/>
         </w:rPr>
-        <w:t xml:space="preserve"> Cited 183 times. IF=10.6/Q1.</w:t>
+        <w:t xml:space="preserve"> Cited 183 times. IF=10.6/Q1. Points=200.</w:t>
       </w:r>
     </w:p>
     <w:p>
@@ -2442,7 +2442,7 @@
           <w:b/>
           <w:sz w:val="22"/>
         </w:rPr>
-        <w:t xml:space="preserve"> Cited 13 times. IF=5.8/Q1.</w:t>
+        <w:t xml:space="preserve"> Cited 13 times. IF=5.8/Q1. Points=140.</w:t>
       </w:r>
     </w:p>
     <w:p>
@@ -2460,7 +2460,7 @@
           <w:b/>
           <w:sz w:val="22"/>
         </w:rPr>
-        <w:t xml:space="preserve"> Cited 21 times. IF=6/Q1.</w:t>
+        <w:t xml:space="preserve"> Cited 21 times. IF=6/Q1. Points=100.</w:t>
       </w:r>
     </w:p>
     <w:p>
@@ -2478,7 +2478,7 @@
           <w:b/>
           <w:sz w:val="22"/>
         </w:rPr>
-        <w:t xml:space="preserve"> Cited 16 times. IF=4.4/Q1.</w:t>
+        <w:t xml:space="preserve"> Cited 16 times. IF=4.4/Q1. Points=20.</w:t>
       </w:r>
     </w:p>
     <w:p>
@@ -2496,7 +2496,7 @@
           <w:b/>
           <w:sz w:val="22"/>
         </w:rPr>
-        <w:t xml:space="preserve"> Cited 21 times. IF=20.3/Q1.</w:t>
+        <w:t xml:space="preserve"> Cited 21 times. IF=20.3/Q1. Points=140.</w:t>
       </w:r>
     </w:p>
     <w:p>
@@ -2514,7 +2514,7 @@
           <w:b/>
           <w:sz w:val="22"/>
         </w:rPr>
-        <w:t xml:space="preserve"> Cited 3 times. IF=3.2/Q2.</w:t>
+        <w:t xml:space="preserve"> Cited 3 times. IF=3.2/Q2. Points=100.</w:t>
       </w:r>
     </w:p>
     <w:p>
@@ -2550,7 +2550,7 @@
           <w:b/>
           <w:sz w:val="22"/>
         </w:rPr>
-        <w:t xml:space="preserve"> Cited 6 times. IF=4.5/Q2.</w:t>
+        <w:t xml:space="preserve"> Cited 6 times. IF=4.5/Q2. Points=100.</w:t>
       </w:r>
     </w:p>
     <w:p>
@@ -2568,7 +2568,7 @@
           <w:b/>
           <w:sz w:val="22"/>
         </w:rPr>
-        <w:t xml:space="preserve"> Cited 75 times. IF=9.9/Q1.</w:t>
+        <w:t xml:space="preserve"> Cited 75 times. IF=9.9/Q1. Points=200.</w:t>
       </w:r>
     </w:p>
     <w:p>
@@ -2594,7 +2594,7 @@
           <w:b/>
           <w:sz w:val="22"/>
         </w:rPr>
-        <w:t xml:space="preserve"> Cited 89 times. IF=5.3/Q1.</w:t>
+        <w:t xml:space="preserve"> Cited 89 times. IF=5.3/Q1. Points=140.</w:t>
       </w:r>
     </w:p>
     <w:p>
@@ -2612,7 +2612,7 @@
           <w:b/>
           <w:sz w:val="22"/>
         </w:rPr>
-        <w:t xml:space="preserve"> Cited 17 times. IF=6.7/Q1.</w:t>
+        <w:t xml:space="preserve"> Cited 17 times. IF=6.7/Q1. Points=20.</w:t>
       </w:r>
     </w:p>
     <w:p>
@@ -2630,7 +2630,7 @@
           <w:b/>
           <w:sz w:val="22"/>
         </w:rPr>
-        <w:t xml:space="preserve"> Cited 66 times. IF=6.3/Q1.</w:t>
+        <w:t xml:space="preserve"> Cited 66 times. IF=6.3/Q1. Points=100.</w:t>
       </w:r>
     </w:p>
     <w:p>
@@ -2648,7 +2648,7 @@
           <w:b/>
           <w:sz w:val="22"/>
         </w:rPr>
-        <w:t xml:space="preserve"> Cited 2278 times. IF=18.6/Q1.</w:t>
+        <w:t xml:space="preserve"> Cited 2278 times. IF=18.6/Q1. Points=200.</w:t>
       </w:r>
     </w:p>
     <w:p>
@@ -2666,7 +2666,7 @@
           <w:b/>
           <w:sz w:val="22"/>
         </w:rPr>
-        <w:t xml:space="preserve"> Cited 66 times. IF=17.4/Q1.</w:t>
+        <w:t xml:space="preserve"> Cited 66 times. IF=17.4/Q1. Points=200.</w:t>
       </w:r>
     </w:p>
     <w:p>
@@ -2684,7 +2684,7 @@
           <w:b/>
           <w:sz w:val="22"/>
         </w:rPr>
-        <w:t xml:space="preserve"> Cited 61 times. IF=8.2/Q1.</w:t>
+        <w:t xml:space="preserve"> Cited 61 times. IF=8.2/Q1. Points=140.</w:t>
       </w:r>
     </w:p>
     <w:p>
@@ -2702,7 +2702,7 @@
           <w:b/>
           <w:sz w:val="22"/>
         </w:rPr>
-        <w:t xml:space="preserve"> Cited 9 times. IF=3.4/Q1.</w:t>
+        <w:t xml:space="preserve"> Cited 9 times. IF=3.4/Q1. Points=40.</w:t>
       </w:r>
     </w:p>
     <w:p>
@@ -2720,7 +2720,7 @@
           <w:b/>
           <w:sz w:val="22"/>
         </w:rPr>
-        <w:t xml:space="preserve"> Cited 11 times. IF=6.7/Q1.</w:t>
+        <w:t xml:space="preserve"> Cited 11 times. IF=6.7/Q1. Points=20.</w:t>
       </w:r>
     </w:p>
     <w:p>
@@ -2738,7 +2738,7 @@
           <w:b/>
           <w:sz w:val="22"/>
         </w:rPr>
-        <w:t xml:space="preserve"> Cited 14 times. IF=2.1/Q2.</w:t>
+        <w:t xml:space="preserve"> Cited 14 times. IF=2.1/Q2. Points=100.</w:t>
       </w:r>
     </w:p>
     <w:p>
@@ -2756,7 +2756,7 @@
           <w:b/>
           <w:sz w:val="22"/>
         </w:rPr>
-        <w:t xml:space="preserve"> Cited 79 times. IF=15.5/Q1.</w:t>
+        <w:t xml:space="preserve"> Cited 79 times. IF=15.5/Q1. Points=140.</w:t>
       </w:r>
     </w:p>
     <w:p>
@@ -2774,7 +2774,7 @@
           <w:b/>
           <w:sz w:val="22"/>
         </w:rPr>
-        <w:t xml:space="preserve"> Cited 134 times. IF=7.9/Q1.</w:t>
+        <w:t xml:space="preserve"> Cited 134 times. IF=7.9/Q1. Points=140.</w:t>
       </w:r>
     </w:p>
     <w:p>
@@ -2792,7 +2792,7 @@
           <w:b/>
           <w:sz w:val="22"/>
         </w:rPr>
-        <w:t xml:space="preserve"> Cited 3 times. IF=5.1/Q2.</w:t>
+        <w:t xml:space="preserve"> Cited 3 times. IF=5.1/Q2. Points=140.</w:t>
       </w:r>
     </w:p>
     <w:p>
@@ -2810,7 +2810,7 @@
           <w:b/>
           <w:sz w:val="22"/>
         </w:rPr>
-        <w:t xml:space="preserve"> Cited 7 times. IF=1.1/Q3.</w:t>
+        <w:t xml:space="preserve"> Cited 7 times. IF=1.1/Q3. Points=100.</w:t>
       </w:r>
     </w:p>
     <w:p>
@@ -2828,7 +2828,7 @@
           <w:b/>
           <w:sz w:val="22"/>
         </w:rPr>
-        <w:t xml:space="preserve"> Cited 10 times. IF=2.4/Q3.</w:t>
+        <w:t xml:space="preserve"> Cited 10 times. IF=2.4/Q3. Points=70.</w:t>
       </w:r>
     </w:p>
     <w:p>
@@ -2846,7 +2846,7 @@
           <w:b/>
           <w:sz w:val="22"/>
         </w:rPr>
-        <w:t xml:space="preserve"> Cited 348 times. IF=8.2/Q1.</w:t>
+        <w:t xml:space="preserve"> Cited 348 times. IF=8.2/Q1. Points=140.</w:t>
       </w:r>
     </w:p>
     <w:p>
@@ -2864,7 +2864,7 @@
           <w:b/>
           <w:sz w:val="22"/>
         </w:rPr>
-        <w:t xml:space="preserve"> Cited 23 times. IF=5.6/Q1.</w:t>
+        <w:t xml:space="preserve"> Cited 23 times. IF=5.6/Q1. Points=140.</w:t>
       </w:r>
     </w:p>
     <w:p>
@@ -2882,7 +2882,7 @@
           <w:b/>
           <w:sz w:val="22"/>
         </w:rPr>
-        <w:t xml:space="preserve"> Cited 63 times. IF=10.6/Q1.</w:t>
+        <w:t xml:space="preserve"> Cited 63 times. IF=10.6/Q1. Points=140.</w:t>
       </w:r>
     </w:p>
     <w:p>
@@ -2900,7 +2900,7 @@
           <w:b/>
           <w:sz w:val="22"/>
         </w:rPr>
-        <w:t xml:space="preserve"> Cited 3 times. IF=7.2/Q1.</w:t>
+        <w:t xml:space="preserve"> Cited 3 times. IF=7.2/Q1. Points=70.</w:t>
       </w:r>
     </w:p>
     <w:p>
@@ -2918,7 +2918,7 @@
           <w:b/>
           <w:sz w:val="22"/>
         </w:rPr>
-        <w:t xml:space="preserve"> Cited 66 times. IF=1.8/Q3.</w:t>
+        <w:t xml:space="preserve"> Cited 66 times. IF=1.8/Q3. Points=70.</w:t>
       </w:r>
     </w:p>
     <w:p>
@@ -2936,7 +2936,7 @@
           <w:b/>
           <w:sz w:val="22"/>
         </w:rPr>
-        <w:t xml:space="preserve"> Cited 15 times. IF=6.7/Q1.</w:t>
+        <w:t xml:space="preserve"> Cited 15 times. IF=6.7/Q1. Points=20.</w:t>
       </w:r>
     </w:p>
     <w:p>
@@ -2954,7 +2954,7 @@
           <w:b/>
           <w:sz w:val="22"/>
         </w:rPr>
-        <w:t xml:space="preserve"> Cited 121 times. IF=4/Q2.</w:t>
+        <w:t xml:space="preserve"> Cited 121 times. IF=4/Q2. Points=70.</w:t>
       </w:r>
     </w:p>
     <w:p>
@@ -2972,7 +2972,7 @@
           <w:b/>
           <w:sz w:val="22"/>
         </w:rPr>
-        <w:t xml:space="preserve"> Cited 30 times. IF=1.1/Q3.</w:t>
+        <w:t xml:space="preserve"> Cited 30 times. IF=1.1/Q3. Points=100.</w:t>
       </w:r>
     </w:p>
     <w:p>
@@ -2990,7 +2990,7 @@
           <w:b/>
           <w:sz w:val="22"/>
         </w:rPr>
-        <w:t xml:space="preserve"> Cited 4641 times. IF=91.2/Q1.</w:t>
+        <w:t xml:space="preserve"> Cited 4641 times. IF=91.2/Q1. Points=200.</w:t>
       </w:r>
     </w:p>
     <w:p>
@@ -3008,7 +3008,7 @@
           <w:b/>
           <w:sz w:val="22"/>
         </w:rPr>
-        <w:t xml:space="preserve"> Cited 11 times. IF=3.7/Q2.</w:t>
+        <w:t xml:space="preserve"> Cited 11 times. IF=3.7/Q2. Points=100.</w:t>
       </w:r>
     </w:p>
     <w:p>
@@ -3026,7 +3026,7 @@
           <w:b/>
           <w:sz w:val="22"/>
         </w:rPr>
-        <w:t xml:space="preserve"> Cited 15 times. IF=5.7/Q1.</w:t>
+        <w:t xml:space="preserve"> Cited 15 times. IF=5.7/Q1. Points=100.</w:t>
       </w:r>
     </w:p>
     <w:p>
@@ -3044,7 +3044,7 @@
           <w:b/>
           <w:sz w:val="22"/>
         </w:rPr>
-        <w:t xml:space="preserve"> Cited 1 times. IF=9.6/Q1.</w:t>
+        <w:t xml:space="preserve"> Cited 1 times. IF=9.6/Q1. Points=140.</w:t>
       </w:r>
     </w:p>
     <w:p>
@@ -3062,7 +3062,7 @@
           <w:b/>
           <w:sz w:val="22"/>
         </w:rPr>
-        <w:t xml:space="preserve"> Cited 40 times. IF=1.1/Q3.</w:t>
+        <w:t xml:space="preserve"> Cited 40 times. IF=1.1/Q3. Points=100.</w:t>
       </w:r>
     </w:p>
     <w:p>
@@ -3080,7 +3080,7 @@
           <w:b/>
           <w:sz w:val="22"/>
         </w:rPr>
-        <w:t xml:space="preserve"> Cited 105 times. IF=5.6/Q1.</w:t>
+        <w:t xml:space="preserve"> Cited 105 times. IF=5.6/Q1. Points=100.</w:t>
       </w:r>
     </w:p>
     <w:p>
@@ -3098,7 +3098,7 @@
           <w:b/>
           <w:sz w:val="22"/>
         </w:rPr>
-        <w:t xml:space="preserve"> Cited 40 times. IF=4.1/Q1.</w:t>
+        <w:t xml:space="preserve"> Cited 40 times. IF=4.1/Q1. Points=100.</w:t>
       </w:r>
     </w:p>
     <w:p>
@@ -3116,7 +3116,7 @@
           <w:b/>
           <w:sz w:val="22"/>
         </w:rPr>
-        <w:t xml:space="preserve"> Cited 60 times. IF=3.4/Q2.</w:t>
+        <w:t xml:space="preserve"> Cited 60 times. IF=3.4/Q2. Points=100.</w:t>
       </w:r>
     </w:p>
     <w:p>
@@ -3134,7 +3134,7 @@
           <w:b/>
           <w:sz w:val="22"/>
         </w:rPr>
-        <w:t xml:space="preserve"> Cited 5 times. IF=5.6/Q1.</w:t>
+        <w:t xml:space="preserve"> Cited 5 times. IF=5.6/Q1. Points=100.</w:t>
       </w:r>
     </w:p>
     <w:p>
@@ -3152,7 +3152,7 @@
           <w:b/>
           <w:sz w:val="22"/>
         </w:rPr>
-        <w:t xml:space="preserve"> Cited 39 times. IF=5.4/Q1.</w:t>
+        <w:t xml:space="preserve"> Cited 39 times. IF=5.4/Q1. Points=100.</w:t>
       </w:r>
     </w:p>
     <w:p>
@@ -3170,7 +3170,7 @@
           <w:b/>
           <w:sz w:val="22"/>
         </w:rPr>
-        <w:t xml:space="preserve"> Cited 14 times. IF=6.7/Q1.</w:t>
+        <w:t xml:space="preserve"> Cited 14 times. IF=6.7/Q1. Points=20.</w:t>
       </w:r>
     </w:p>
     <w:p>
@@ -3188,7 +3188,7 @@
           <w:b/>
           <w:sz w:val="22"/>
         </w:rPr>
-        <w:t xml:space="preserve"> Cited 1 times. IF=0.4/Q4.</w:t>
+        <w:t xml:space="preserve"> Cited 1 times. IF=0.4/Q4. Points=20.</w:t>
       </w:r>
     </w:p>
     <w:p>
@@ -3206,7 +3206,7 @@
           <w:b/>
           <w:sz w:val="22"/>
         </w:rPr>
-        <w:t xml:space="preserve"> Cited 8 times. IF=2.1/Q2.</w:t>
+        <w:t xml:space="preserve"> Cited 8 times. IF=2.1/Q2. Points=100.</w:t>
       </w:r>
     </w:p>
     <w:p>
@@ -3224,7 +3224,7 @@
           <w:b/>
           <w:sz w:val="22"/>
         </w:rPr>
-        <w:t xml:space="preserve"> Cited 104 times. IF=6.8/Q1.</w:t>
+        <w:t xml:space="preserve"> Cited 104 times. IF=6.8/Q1. Points=140.</w:t>
       </w:r>
     </w:p>
     <w:p>
@@ -3250,7 +3250,7 @@
           <w:b/>
           <w:sz w:val="22"/>
         </w:rPr>
-        <w:t xml:space="preserve"> Cited 98 times. IF=3.8/Q1.</w:t>
+        <w:t xml:space="preserve"> Cited 98 times. IF=3.8/Q1. Points=70.</w:t>
       </w:r>
     </w:p>
     <w:p>
@@ -3268,7 +3268,7 @@
           <w:b/>
           <w:sz w:val="22"/>
         </w:rPr>
-        <w:t xml:space="preserve"> Cited 30 times. IF=3.4/Q3.</w:t>
+        <w:t xml:space="preserve"> Cited 30 times. IF=3.4/Q3. Points=70.</w:t>
       </w:r>
     </w:p>
     <w:p>
@@ -3286,7 +3286,7 @@
           <w:b/>
           <w:sz w:val="22"/>
         </w:rPr>
-        <w:t xml:space="preserve"> Cited 19 times. IF=6.5/Q1.</w:t>
+        <w:t xml:space="preserve"> Cited 19 times. IF=6.5/Q1. Points=100.</w:t>
       </w:r>
     </w:p>
     <w:p>
@@ -3304,7 +3304,7 @@
           <w:b/>
           <w:sz w:val="22"/>
         </w:rPr>
-        <w:t xml:space="preserve"> Cited 76 times. IF=6.7/Q1.</w:t>
+        <w:t xml:space="preserve"> Cited 76 times. IF=6.7/Q1. Points=20.</w:t>
       </w:r>
     </w:p>
     <w:p>
@@ -3322,7 +3322,7 @@
           <w:b/>
           <w:sz w:val="22"/>
         </w:rPr>
-        <w:t xml:space="preserve"> Cited 99 times. IF=9.9/Q1.</w:t>
+        <w:t xml:space="preserve"> Cited 99 times. IF=9.9/Q1. Points=200.</w:t>
       </w:r>
     </w:p>
     <w:p>
@@ -3340,7 +3340,7 @@
           <w:b/>
           <w:sz w:val="22"/>
         </w:rPr>
-        <w:t xml:space="preserve"> Cited 36 times. IF=5.6/Q1.</w:t>
+        <w:t xml:space="preserve"> Cited 36 times. IF=5.6/Q1. Points=140.</w:t>
       </w:r>
     </w:p>
     <w:p>
@@ -3358,7 +3358,7 @@
           <w:b/>
           <w:sz w:val="22"/>
         </w:rPr>
-        <w:t xml:space="preserve"> Cited 27 times. IF=1.4/Q3.</w:t>
+        <w:t xml:space="preserve"> Cited 27 times. IF=1.4/Q3. Points=100.</w:t>
       </w:r>
     </w:p>
     <w:p>
@@ -3376,7 +3376,7 @@
           <w:b/>
           <w:sz w:val="22"/>
         </w:rPr>
-        <w:t xml:space="preserve"> Cited 8 times. IF=1.7/Q3.</w:t>
+        <w:t xml:space="preserve"> Cited 8 times. IF=1.7/Q3. Points=40.</w:t>
       </w:r>
     </w:p>
     <w:p>
@@ -3394,7 +3394,7 @@
           <w:b/>
           <w:sz w:val="22"/>
         </w:rPr>
-        <w:t xml:space="preserve"> Cited 7 times. IF=3.3/Q3.</w:t>
+        <w:t xml:space="preserve"> Cited 7 times. IF=3.3/Q3. Points=100.</w:t>
       </w:r>
     </w:p>
     <w:p>
@@ -3412,7 +3412,7 @@
           <w:b/>
           <w:sz w:val="22"/>
         </w:rPr>
-        <w:t xml:space="preserve"> Cited 13 times. IF=12.2/Q1.</w:t>
+        <w:t xml:space="preserve"> Cited 13 times. IF=12.2/Q1. Points=100.</w:t>
       </w:r>
     </w:p>
     <w:p>
@@ -3430,7 +3430,7 @@
           <w:b/>
           <w:sz w:val="22"/>
         </w:rPr>
-        <w:t xml:space="preserve"> Cited 42 times. IF=2.8/Q3.</w:t>
+        <w:t xml:space="preserve"> Cited 42 times. IF=2.8/Q3. Points=70.</w:t>
       </w:r>
     </w:p>
     <w:p>
@@ -3448,7 +3448,7 @@
           <w:b/>
           <w:sz w:val="22"/>
         </w:rPr>
-        <w:t xml:space="preserve"> Cited 47 times. IF=5.8/Q1.</w:t>
+        <w:t xml:space="preserve"> Cited 47 times. IF=5.8/Q1. Points=140.</w:t>
       </w:r>
     </w:p>
     <w:p>
@@ -3466,7 +3466,7 @@
           <w:b/>
           <w:sz w:val="22"/>
         </w:rPr>
-        <w:t xml:space="preserve"> Cited 99 times. IF=5.6/Q1.</w:t>
+        <w:t xml:space="preserve"> Cited 99 times. IF=5.6/Q1. Points=140.</w:t>
       </w:r>
     </w:p>
     <w:p>
@@ -3484,7 +3484,7 @@
           <w:b/>
           <w:sz w:val="22"/>
         </w:rPr>
-        <w:t xml:space="preserve"> Cited 108 times. IF=6.7/Q1.</w:t>
+        <w:t xml:space="preserve"> Cited 108 times. IF=6.7/Q1. Points=20.</w:t>
       </w:r>
     </w:p>
     <w:p>
@@ -3502,7 +3502,7 @@
           <w:b/>
           <w:sz w:val="22"/>
         </w:rPr>
-        <w:t xml:space="preserve"> Cited 6 times. IF=2.1/Q2.</w:t>
+        <w:t xml:space="preserve"> Cited 6 times. IF=2.1/Q2. Points=100.</w:t>
       </w:r>
     </w:p>
     <w:p>
@@ -3520,7 +3520,7 @@
           <w:b/>
           <w:sz w:val="22"/>
         </w:rPr>
-        <w:t xml:space="preserve"> Cited 70 times. IF=6.4/Q1.</w:t>
+        <w:t xml:space="preserve"> Cited 70 times. IF=6.4/Q1. Points=200.</w:t>
       </w:r>
     </w:p>
     <w:p>
@@ -3538,7 +3538,7 @@
           <w:b/>
           <w:sz w:val="22"/>
         </w:rPr>
-        <w:t xml:space="preserve"> Cited 28 times. IF=4.1/Q1.</w:t>
+        <w:t xml:space="preserve"> Cited 28 times. IF=4.1/Q1. Points=100.</w:t>
       </w:r>
     </w:p>
     <w:p>
@@ -3556,7 +3556,7 @@
           <w:b/>
           <w:sz w:val="22"/>
         </w:rPr>
-        <w:t xml:space="preserve"> Cited 17 times. IF=4.1/Q2.</w:t>
+        <w:t xml:space="preserve"> Cited 17 times. IF=4.1/Q2. Points=100.</w:t>
       </w:r>
     </w:p>
     <w:p>
@@ -3574,7 +3574,7 @@
           <w:b/>
           <w:sz w:val="22"/>
         </w:rPr>
-        <w:t xml:space="preserve"> Cited 5 times. IF=5.1/Q2.</w:t>
+        <w:t xml:space="preserve"> Cited 5 times. IF=5.1/Q2. Points=140.</w:t>
       </w:r>
     </w:p>
     <w:p>
@@ -3592,7 +3592,7 @@
           <w:b/>
           <w:sz w:val="22"/>
         </w:rPr>
-        <w:t xml:space="preserve"> Cited 66 times. IF=5.6/Q1.</w:t>
+        <w:t xml:space="preserve"> Cited 66 times. IF=5.6/Q1. Points=140.</w:t>
       </w:r>
     </w:p>
     <w:p>
@@ -3610,7 +3610,7 @@
           <w:b/>
           <w:sz w:val="22"/>
         </w:rPr>
-        <w:t xml:space="preserve"> Cited 41 times. IF=8.2/Q1.</w:t>
+        <w:t xml:space="preserve"> Cited 41 times. IF=8.2/Q1. Points=100.</w:t>
       </w:r>
     </w:p>
     <w:p>
@@ -3628,7 +3628,7 @@
           <w:b/>
           <w:sz w:val="22"/>
         </w:rPr>
-        <w:t xml:space="preserve"> Cited 85 times. IF=5.6/Q1.</w:t>
+        <w:t xml:space="preserve"> Cited 85 times. IF=5.6/Q1. Points=140.</w:t>
       </w:r>
     </w:p>
     <w:p>
@@ -3646,7 +3646,7 @@
           <w:b/>
           <w:sz w:val="22"/>
         </w:rPr>
-        <w:t xml:space="preserve"> Cited 61 times. IF=5.1/Q2.</w:t>
+        <w:t xml:space="preserve"> Cited 61 times. IF=5.1/Q2. Points=140.</w:t>
       </w:r>
     </w:p>
     <w:p>
@@ -3664,7 +3664,7 @@
           <w:b/>
           <w:sz w:val="22"/>
         </w:rPr>
-        <w:t xml:space="preserve"> Cited 21 times. IF=5.8/Q1.</w:t>
+        <w:t xml:space="preserve"> Cited 21 times. IF=5.8/Q1. Points=140.</w:t>
       </w:r>
     </w:p>
     <w:p>
@@ -3682,7 +3682,7 @@
           <w:b/>
           <w:sz w:val="22"/>
         </w:rPr>
-        <w:t xml:space="preserve"> Cited 44 times. IF=6.9/Q1.</w:t>
+        <w:t xml:space="preserve"> Cited 44 times. IF=6.9/Q1. Points=100.</w:t>
       </w:r>
     </w:p>
     <w:p>
@@ -3700,7 +3700,7 @@
           <w:b/>
           <w:sz w:val="22"/>
         </w:rPr>
-        <w:t xml:space="preserve"> Cited 36 times. IF=1.1/Q3.</w:t>
+        <w:t xml:space="preserve"> Cited 36 times. IF=1.1/Q3. Points=100.</w:t>
       </w:r>
     </w:p>
     <w:p>
@@ -3718,7 +3718,7 @@
           <w:b/>
           <w:sz w:val="22"/>
         </w:rPr>
-        <w:t xml:space="preserve"> Cited 70 times. IF=6.8/Q1.</w:t>
+        <w:t xml:space="preserve"> Cited 70 times. IF=6.8/Q1. Points=140.</w:t>
       </w:r>
     </w:p>
     <w:p>
@@ -3736,7 +3736,7 @@
           <w:b/>
           <w:sz w:val="22"/>
         </w:rPr>
-        <w:t xml:space="preserve"> Cited 80 times. IF=5.4/Q1.</w:t>
+        <w:t xml:space="preserve"> Cited 80 times. IF=5.4/Q1. Points=100.</w:t>
       </w:r>
     </w:p>
     <w:p>
@@ -3754,7 +3754,7 @@
           <w:b/>
           <w:sz w:val="22"/>
         </w:rPr>
-        <w:t xml:space="preserve"> Cited 21 times. IF=5.4/Q1.</w:t>
+        <w:t xml:space="preserve"> Cited 21 times. IF=5.4/Q1. Points=100.</w:t>
       </w:r>
     </w:p>
     <w:p>
@@ -3772,7 +3772,7 @@
           <w:b/>
           <w:sz w:val="22"/>
         </w:rPr>
-        <w:t xml:space="preserve"> Cited 15 times. IF=3.7/Q2.</w:t>
+        <w:t xml:space="preserve"> Cited 15 times. IF=3.7/Q2. Points=70.</w:t>
       </w:r>
     </w:p>
     <w:p>
@@ -3790,7 +3790,7 @@
           <w:b/>
           <w:sz w:val="22"/>
         </w:rPr>
-        <w:t xml:space="preserve"> Cited 36 times. IF=6.8/Q1.</w:t>
+        <w:t xml:space="preserve"> Cited 36 times. IF=6.8/Q1. Points=140.</w:t>
       </w:r>
     </w:p>
     <w:p>
@@ -3808,7 +3808,7 @@
           <w:b/>
           <w:sz w:val="22"/>
         </w:rPr>
-        <w:t xml:space="preserve"> Cited 166 times. IF=14.1/Q1.</w:t>
+        <w:t xml:space="preserve"> Cited 166 times. IF=14.1/Q1. Points=200.</w:t>
       </w:r>
     </w:p>
     <w:p>
@@ -3834,7 +3834,7 @@
           <w:b/>
           <w:sz w:val="22"/>
         </w:rPr>
-        <w:t xml:space="preserve"> Cited 387 times. IF=5.6/Q1.</w:t>
+        <w:t xml:space="preserve"> Cited 387 times. IF=5.6/Q1. Points=140.</w:t>
       </w:r>
     </w:p>
     <w:p>
@@ -3852,7 +3852,7 @@
           <w:b/>
           <w:sz w:val="22"/>
         </w:rPr>
-        <w:t xml:space="preserve"> Cited 11 times. IF=6.7/Q1.</w:t>
+        <w:t xml:space="preserve"> Cited 11 times. IF=6.7/Q1. Points=20.</w:t>
       </w:r>
     </w:p>
     <w:p>
@@ -3870,7 +3870,7 @@
           <w:b/>
           <w:sz w:val="22"/>
         </w:rPr>
-        <w:t xml:space="preserve"> Cited 77 times. IF=1.1/Q3.</w:t>
+        <w:t xml:space="preserve"> Cited 77 times. IF=1.1/Q3. Points=100.</w:t>
       </w:r>
     </w:p>
     <w:p>
@@ -3888,7 +3888,7 @@
           <w:b/>
           <w:sz w:val="22"/>
         </w:rPr>
-        <w:t xml:space="preserve"> Cited 29 times. IF=2.9/Q2.</w:t>
+        <w:t xml:space="preserve"> Cited 29 times. IF=2.9/Q2. Points=100.</w:t>
       </w:r>
     </w:p>
     <w:p>
@@ -3906,7 +3906,7 @@
           <w:b/>
           <w:sz w:val="22"/>
         </w:rPr>
-        <w:t xml:space="preserve"> Cited 48 times. IF=5.7/Q1.</w:t>
+        <w:t xml:space="preserve"> Cited 48 times. IF=5.7/Q1. Points=100.</w:t>
       </w:r>
     </w:p>
     <w:p>
@@ -3924,7 +3924,7 @@
           <w:b/>
           <w:sz w:val="22"/>
         </w:rPr>
-        <w:t xml:space="preserve"> Cited 72 times. IF=2.9/Q3.</w:t>
+        <w:t xml:space="preserve"> Cited 72 times. IF=2.9/Q3. Points=40.</w:t>
       </w:r>
     </w:p>
     <w:p>
@@ -3942,7 +3942,7 @@
           <w:b/>
           <w:sz w:val="22"/>
         </w:rPr>
-        <w:t xml:space="preserve"> Cited 16 times. IF=5.1/Q2.</w:t>
+        <w:t xml:space="preserve"> Cited 16 times. IF=5.1/Q2. Points=140.</w:t>
       </w:r>
     </w:p>
     <w:p>
@@ -3960,7 +3960,7 @@
           <w:b/>
           <w:sz w:val="22"/>
         </w:rPr>
-        <w:t xml:space="preserve"> Cited 216 times. IF=20.3/Q1.</w:t>
+        <w:t xml:space="preserve"> Cited 216 times. IF=20.3/Q1. Points=200.</w:t>
       </w:r>
     </w:p>
     <w:p>
@@ -3978,7 +3978,7 @@
           <w:b/>
           <w:sz w:val="22"/>
         </w:rPr>
-        <w:t xml:space="preserve"> Cited 62 times. IF=5.6/Q1.</w:t>
+        <w:t xml:space="preserve"> Cited 62 times. IF=5.6/Q1. Points=140.</w:t>
       </w:r>
     </w:p>
     <w:p>
@@ -3996,7 +3996,7 @@
           <w:b/>
           <w:sz w:val="22"/>
         </w:rPr>
-        <w:t xml:space="preserve"> Cited 31 times. IF=2.5/Q2.</w:t>
+        <w:t xml:space="preserve"> Cited 31 times. IF=2.5/Q2. Points=70.</w:t>
       </w:r>
     </w:p>
     <w:p>
@@ -4014,7 +4014,7 @@
           <w:b/>
           <w:sz w:val="22"/>
         </w:rPr>
-        <w:t xml:space="preserve"> Cited 79 times.</w:t>
+        <w:t xml:space="preserve"> Cited 79 times. Points=20.</w:t>
       </w:r>
     </w:p>
     <w:p>
@@ -4032,7 +4032,7 @@
           <w:b/>
           <w:sz w:val="22"/>
         </w:rPr>
-        <w:t xml:space="preserve"> Cited 332 times. IF=5.7/Q1.</w:t>
+        <w:t xml:space="preserve"> Cited 332 times. IF=5.7/Q1. Points=100.</w:t>
       </w:r>
     </w:p>
     <w:p>
@@ -4050,7 +4050,7 @@
           <w:b/>
           <w:sz w:val="22"/>
         </w:rPr>
-        <w:t xml:space="preserve"> Cited 99 times. IF=8.7/Q1.</w:t>
+        <w:t xml:space="preserve"> Cited 99 times. IF=8.7/Q1. Points=200.</w:t>
       </w:r>
     </w:p>
     <w:p>
@@ -4068,7 +4068,7 @@
           <w:b/>
           <w:sz w:val="22"/>
         </w:rPr>
-        <w:t xml:space="preserve"> Cited 21 times. IF=6.7/Q1.</w:t>
+        <w:t xml:space="preserve"> Cited 21 times. IF=6.7/Q1. Points=140.</w:t>
       </w:r>
     </w:p>
     <w:p>
@@ -4086,7 +4086,7 @@
           <w:b/>
           <w:sz w:val="22"/>
         </w:rPr>
-        <w:t xml:space="preserve"> Cited 115 times. IF=4.9/Q2.</w:t>
+        <w:t xml:space="preserve"> Cited 115 times. IF=4.9/Q2. Points=140.</w:t>
       </w:r>
     </w:p>
     <w:p>
@@ -4104,7 +4104,7 @@
           <w:b/>
           <w:sz w:val="22"/>
         </w:rPr>
-        <w:t xml:space="preserve"> Cited 856 times. IF=4.8/Q2.</w:t>
+        <w:t xml:space="preserve"> Cited 856 times. IF=4.8/Q2. Points=140.</w:t>
       </w:r>
     </w:p>
     <w:p>
@@ -4122,7 +4122,7 @@
           <w:b/>
           <w:sz w:val="22"/>
         </w:rPr>
-        <w:t xml:space="preserve"> Cited 307 times. IF=5.6/Q1.</w:t>
+        <w:t xml:space="preserve"> Cited 307 times. IF=5.6/Q1. Points=140.</w:t>
       </w:r>
     </w:p>
     <w:p>
@@ -4140,7 +4140,7 @@
           <w:b/>
           <w:sz w:val="22"/>
         </w:rPr>
-        <w:t xml:space="preserve"> Cited 2 times. IF=5.1/Q2.</w:t>
+        <w:t xml:space="preserve"> Cited 2 times. IF=5.1/Q2. Points=140.</w:t>
       </w:r>
     </w:p>
     <w:p>
@@ -4158,7 +4158,7 @@
           <w:b/>
           <w:sz w:val="22"/>
         </w:rPr>
-        <w:t xml:space="preserve"> Cited 28 times. IF=2.4/Q3.</w:t>
+        <w:t xml:space="preserve"> Cited 28 times. IF=2.4/Q3. Points=70.</w:t>
       </w:r>
     </w:p>
     <w:p>
@@ -4176,7 +4176,7 @@
           <w:b/>
           <w:sz w:val="22"/>
         </w:rPr>
-        <w:t xml:space="preserve"> Cited 25 times. IF=6.7/Q1.</w:t>
+        <w:t xml:space="preserve"> Cited 25 times. IF=6.7/Q1. Points=140.</w:t>
       </w:r>
     </w:p>
     <w:p>
@@ -4194,7 +4194,7 @@
           <w:b/>
           <w:sz w:val="22"/>
         </w:rPr>
-        <w:t xml:space="preserve"> Cited 32 times. IF=2.7/Q2.</w:t>
+        <w:t xml:space="preserve"> Cited 32 times. IF=2.7/Q2. Points=100.</w:t>
       </w:r>
     </w:p>
     <w:p>
@@ -4212,7 +4212,7 @@
           <w:b/>
           <w:sz w:val="22"/>
         </w:rPr>
-        <w:t xml:space="preserve"> Cited 33 times. IF=6.7/Q1.</w:t>
+        <w:t xml:space="preserve"> Cited 33 times. IF=6.7/Q1. Points=20.</w:t>
       </w:r>
     </w:p>
     <w:p>
@@ -4230,7 +4230,7 @@
           <w:b/>
           <w:sz w:val="22"/>
         </w:rPr>
-        <w:t xml:space="preserve"> Cited 13 times. IF=3.7/Q2.</w:t>
+        <w:t xml:space="preserve"> Cited 13 times. IF=3.7/Q2. Points=100.</w:t>
       </w:r>
     </w:p>
     <w:p>
@@ -4248,7 +4248,7 @@
           <w:b/>
           <w:sz w:val="22"/>
         </w:rPr>
-        <w:t xml:space="preserve"> Cited 10 times. IF=2/Q3.</w:t>
+        <w:t xml:space="preserve"> Cited 10 times. IF=2/Q3. Points=70.</w:t>
       </w:r>
     </w:p>
     <w:p>
@@ -4266,7 +4266,7 @@
           <w:b/>
           <w:sz w:val="22"/>
         </w:rPr>
-        <w:t xml:space="preserve"> Cited 66 times. IF=1.1/Q3.</w:t>
+        <w:t xml:space="preserve"> Cited 66 times. IF=1.1/Q3. Points=100.</w:t>
       </w:r>
     </w:p>
     <w:p>
@@ -4284,7 +4284,7 @@
           <w:b/>
           <w:sz w:val="22"/>
         </w:rPr>
-        <w:t xml:space="preserve"> Cited 126 times. IF=4.4/Q2.</w:t>
+        <w:t xml:space="preserve"> Cited 126 times. IF=4.4/Q2. Points=140.</w:t>
       </w:r>
     </w:p>
     <w:p>
@@ -4302,7 +4302,7 @@
           <w:b/>
           <w:sz w:val="22"/>
         </w:rPr>
-        <w:t xml:space="preserve"> Cited 24 times. IF=5.1/Q2.</w:t>
+        <w:t xml:space="preserve"> Cited 24 times. IF=5.1/Q2. Points=140.</w:t>
       </w:r>
     </w:p>
     <w:p>
@@ -4320,7 +4320,7 @@
           <w:b/>
           <w:sz w:val="22"/>
         </w:rPr>
-        <w:t xml:space="preserve"> Cited 2 times. IF=3.2/Q2.</w:t>
+        <w:t xml:space="preserve"> Cited 2 times. IF=3.2/Q2. Points=100.</w:t>
       </w:r>
     </w:p>
     <w:p>
@@ -4338,7 +4338,7 @@
           <w:b/>
           <w:sz w:val="22"/>
         </w:rPr>
-        <w:t xml:space="preserve"> Cited 266 times. IF=4.8/Q2.</w:t>
+        <w:t xml:space="preserve"> Cited 266 times. IF=4.8/Q2. Points=140.</w:t>
       </w:r>
     </w:p>
     <w:p>
@@ -4356,7 +4356,7 @@
           <w:b/>
           <w:sz w:val="22"/>
         </w:rPr>
-        <w:t xml:space="preserve"> Cited 81 times. IF=5.6/Q1.</w:t>
+        <w:t xml:space="preserve"> Cited 81 times. IF=5.6/Q1. Points=140.</w:t>
       </w:r>
     </w:p>
     <w:p>
@@ -4374,7 +4374,7 @@
           <w:b/>
           <w:sz w:val="22"/>
         </w:rPr>
-        <w:t xml:space="preserve"> Cited 178 times.</w:t>
+        <w:t xml:space="preserve"> Cited 178 times. Points=20.</w:t>
       </w:r>
     </w:p>
     <w:p>
@@ -4392,7 +4392,7 @@
           <w:b/>
           <w:sz w:val="22"/>
         </w:rPr>
-        <w:t xml:space="preserve"> Cited 20 times. IF=5.1/Q2.</w:t>
+        <w:t xml:space="preserve"> Cited 20 times. IF=5.1/Q2. Points=140.</w:t>
       </w:r>
     </w:p>
     <w:p>
@@ -4410,7 +4410,7 @@
           <w:b/>
           <w:sz w:val="22"/>
         </w:rPr>
-        <w:t xml:space="preserve"> Cited 58 times. IF=5.4/Q1.</w:t>
+        <w:t xml:space="preserve"> Cited 58 times. IF=5.4/Q1. Points=100.</w:t>
       </w:r>
     </w:p>
     <w:p>
@@ -4428,7 +4428,7 @@
           <w:b/>
           <w:sz w:val="22"/>
         </w:rPr>
-        <w:t xml:space="preserve"> Cited 26 times.</w:t>
+        <w:t xml:space="preserve"> Cited 26 times. Points=100.</w:t>
       </w:r>
     </w:p>
     <w:p>
@@ -4446,7 +4446,7 @@
           <w:b/>
           <w:sz w:val="22"/>
         </w:rPr>
-        <w:t xml:space="preserve"> Cited 6 times. IF=2.5/Q2.</w:t>
+        <w:t xml:space="preserve"> Cited 6 times. IF=2.5/Q2. Points=70.</w:t>
       </w:r>
     </w:p>
     <w:p>
@@ -4464,7 +4464,7 @@
           <w:b/>
           <w:sz w:val="22"/>
         </w:rPr>
-        <w:t xml:space="preserve"> Cited 69 times. IF=5.1/Q2.</w:t>
+        <w:t xml:space="preserve"> Cited 69 times. IF=5.1/Q2. Points=140.</w:t>
       </w:r>
     </w:p>
     <w:p>
@@ -4482,7 +4482,7 @@
           <w:b/>
           <w:sz w:val="22"/>
         </w:rPr>
-        <w:t xml:space="preserve"> Cited 11 times. IF=11.3/Q1.</w:t>
+        <w:t xml:space="preserve"> Cited 11 times. IF=11.3/Q1. Points=140.</w:t>
       </w:r>
     </w:p>
     <w:p>
@@ -4500,7 +4500,7 @@
           <w:b/>
           <w:sz w:val="22"/>
         </w:rPr>
-        <w:t xml:space="preserve"> Cited 13 times. IF=3.8/Q2.</w:t>
+        <w:t xml:space="preserve"> Cited 13 times. IF=3.8/Q2. Points=20.</w:t>
       </w:r>
     </w:p>
     <w:p>
@@ -4536,7 +4536,7 @@
           <w:b/>
           <w:sz w:val="22"/>
         </w:rPr>
-        <w:t xml:space="preserve"> Cited 27 times. IF=6.8/Q1.</w:t>
+        <w:t xml:space="preserve"> Cited 27 times. IF=6.8/Q1. Points=140.</w:t>
       </w:r>
     </w:p>
     <w:p>
@@ -4554,7 +4554,7 @@
           <w:b/>
           <w:sz w:val="22"/>
         </w:rPr>
-        <w:t xml:space="preserve"> Cited 80 times. IF=5.9/Q1.</w:t>
+        <w:t xml:space="preserve"> Cited 80 times. IF=5.9/Q1. Points=100.</w:t>
       </w:r>
     </w:p>
     <w:p>
@@ -4572,7 +4572,7 @@
           <w:b/>
           <w:sz w:val="22"/>
         </w:rPr>
-        <w:t xml:space="preserve"> Cited 18 times. IF=8.1/Q1.</w:t>
+        <w:t xml:space="preserve"> Cited 18 times. IF=8.1/Q1. Points=200.</w:t>
       </w:r>
     </w:p>
     <w:p>
@@ -4590,7 +4590,7 @@
           <w:b/>
           <w:sz w:val="22"/>
         </w:rPr>
-        <w:t xml:space="preserve"> Cited 19 times. IF=5.1/Q2.</w:t>
+        <w:t xml:space="preserve"> Cited 19 times. IF=5.1/Q2. Points=140.</w:t>
       </w:r>
     </w:p>
     <w:p>
@@ -4608,7 +4608,7 @@
           <w:b/>
           <w:sz w:val="22"/>
         </w:rPr>
-        <w:t xml:space="preserve"> Cited 104 times. IF=8.2/Q1.</w:t>
+        <w:t xml:space="preserve"> Cited 104 times. IF=8.2/Q1. Points=100.</w:t>
       </w:r>
     </w:p>
     <w:p>
@@ -4634,7 +4634,7 @@
           <w:b/>
           <w:sz w:val="22"/>
         </w:rPr>
-        <w:t xml:space="preserve"> Cited 27 times. IF=4.5/Q2.</w:t>
+        <w:t xml:space="preserve"> Cited 27 times. IF=4.5/Q2. Points=100.</w:t>
       </w:r>
     </w:p>
     <w:p>
@@ -4652,7 +4652,7 @@
           <w:b/>
           <w:sz w:val="22"/>
         </w:rPr>
-        <w:t xml:space="preserve"> Cited 21 times. IF=6.4/Q1.</w:t>
+        <w:t xml:space="preserve"> Cited 21 times. IF=6.4/Q1. Points=200.</w:t>
       </w:r>
     </w:p>
     <w:p>
@@ -4670,7 +4670,7 @@
           <w:b/>
           <w:sz w:val="22"/>
         </w:rPr>
-        <w:t xml:space="preserve"> Cited 132 times. IF=5.1/Q2.</w:t>
+        <w:t xml:space="preserve"> Cited 132 times. IF=5.1/Q2. Points=140.</w:t>
       </w:r>
     </w:p>
     <w:p>
@@ -4688,7 +4688,7 @@
           <w:b/>
           <w:sz w:val="22"/>
         </w:rPr>
-        <w:t xml:space="preserve"> Cited 200 times. IF=5.4/Q1.</w:t>
+        <w:t xml:space="preserve"> Cited 200 times. IF=5.4/Q1. Points=100.</w:t>
       </w:r>
     </w:p>
     <w:p>
@@ -4706,7 +4706,7 @@
           <w:b/>
           <w:sz w:val="22"/>
         </w:rPr>
-        <w:t xml:space="preserve"> Cited 81 times. IF=10.4/Q1.</w:t>
+        <w:t xml:space="preserve"> Cited 81 times. IF=10.4/Q1. Points=200.</w:t>
       </w:r>
     </w:p>
     <w:p>
@@ -4724,7 +4724,7 @@
           <w:b/>
           <w:sz w:val="22"/>
         </w:rPr>
-        <w:t xml:space="preserve"> Cited 117 times. IF=5.2/Q1.</w:t>
+        <w:t xml:space="preserve"> Cited 117 times. IF=5.2/Q1. Points=100.</w:t>
       </w:r>
     </w:p>
     <w:p>
@@ -4742,7 +4742,7 @@
           <w:b/>
           <w:sz w:val="22"/>
         </w:rPr>
-        <w:t xml:space="preserve"> Cited 160 times. IF=17.4/Q1.</w:t>
+        <w:t xml:space="preserve"> Cited 160 times. IF=17.4/Q1. Points=200.</w:t>
       </w:r>
     </w:p>
     <w:p>
@@ -4760,7 +4760,7 @@
           <w:b/>
           <w:sz w:val="22"/>
         </w:rPr>
-        <w:t xml:space="preserve"> Cited 37 times. IF=5.7/Q1.</w:t>
+        <w:t xml:space="preserve"> Cited 37 times. IF=5.7/Q1. Points=100.</w:t>
       </w:r>
     </w:p>
     <w:p>
@@ -4778,7 +4778,7 @@
           <w:b/>
           <w:sz w:val="22"/>
         </w:rPr>
-        <w:t xml:space="preserve"> Cited 24 times. IF=5.1/Q2.</w:t>
+        <w:t xml:space="preserve"> Cited 24 times. IF=5.1/Q2. Points=140.</w:t>
       </w:r>
     </w:p>
     <w:p>
@@ -4796,7 +4796,7 @@
           <w:b/>
           <w:sz w:val="22"/>
         </w:rPr>
-        <w:t xml:space="preserve"> Cited 89 times. IF=8/Q1.</w:t>
+        <w:t xml:space="preserve"> Cited 89 times. IF=8/Q1. Points=140.</w:t>
       </w:r>
     </w:p>
     <w:p>
@@ -4814,7 +4814,7 @@
           <w:b/>
           <w:sz w:val="22"/>
         </w:rPr>
-        <w:t xml:space="preserve"> Cited 84 times. IF=14.1/Q1.</w:t>
+        <w:t xml:space="preserve"> Cited 84 times. IF=14.1/Q1. Points=200.</w:t>
       </w:r>
     </w:p>
     <w:p>
@@ -4832,7 +4832,7 @@
           <w:b/>
           <w:sz w:val="22"/>
         </w:rPr>
-        <w:t xml:space="preserve"> Cited 12 times. IF=14.1/Q1.</w:t>
+        <w:t xml:space="preserve"> Cited 12 times. IF=14.1/Q1. Points=200.</w:t>
       </w:r>
     </w:p>
     <w:p>
@@ -4850,7 +4850,7 @@
           <w:b/>
           <w:sz w:val="22"/>
         </w:rPr>
-        <w:t xml:space="preserve"> Cited 25 times. IF=8.7/Q1.</w:t>
+        <w:t xml:space="preserve"> Cited 25 times. IF=8.7/Q1. Points=140.</w:t>
       </w:r>
     </w:p>
     <w:p>
@@ -4868,7 +4868,7 @@
           <w:b/>
           <w:sz w:val="22"/>
         </w:rPr>
-        <w:t xml:space="preserve"> Cited 437 times. IF=13.5/Q1.</w:t>
+        <w:t xml:space="preserve"> Cited 437 times. IF=13.5/Q1. Points=140.</w:t>
       </w:r>
     </w:p>
     <w:p>
@@ -4886,7 +4886,7 @@
           <w:b/>
           <w:sz w:val="22"/>
         </w:rPr>
-        <w:t xml:space="preserve"> Cited 41 times. IF=11.8/Q1.</w:t>
+        <w:t xml:space="preserve"> Cited 41 times. IF=11.8/Q1. Points=140.</w:t>
       </w:r>
     </w:p>
     <w:p>
@@ -4904,7 +4904,7 @@
           <w:b/>
           <w:sz w:val="22"/>
         </w:rPr>
-        <w:t xml:space="preserve"> Cited 159 times. IF=14.1/Q1.</w:t>
+        <w:t xml:space="preserve"> Cited 159 times. IF=14.1/Q1. Points=200.</w:t>
       </w:r>
     </w:p>
     <w:p>
@@ -4922,7 +4922,7 @@
           <w:b/>
           <w:sz w:val="22"/>
         </w:rPr>
-        <w:t xml:space="preserve"> Cited 100 times. IF=11.8/Q1.</w:t>
+        <w:t xml:space="preserve"> Cited 100 times. IF=11.8/Q1. Points=140.</w:t>
       </w:r>
     </w:p>
     <w:p>
@@ -4940,7 +4940,7 @@
           <w:b/>
           <w:sz w:val="22"/>
         </w:rPr>
-        <w:t xml:space="preserve"> Cited 82 times. IF=6.7/Q1.</w:t>
+        <w:t xml:space="preserve"> Cited 82 times. IF=6.7/Q1. Points=140.</w:t>
       </w:r>
     </w:p>
     <w:p>
@@ -4958,7 +4958,7 @@
           <w:b/>
           <w:sz w:val="22"/>
         </w:rPr>
-        <w:t xml:space="preserve"> Cited 5 times. IF=1.1/Q3.</w:t>
+        <w:t xml:space="preserve"> Cited 5 times. IF=1.1/Q3. Points=100.</w:t>
       </w:r>
     </w:p>
     <w:p>
@@ -4976,7 +4976,7 @@
           <w:b/>
           <w:sz w:val="22"/>
         </w:rPr>
-        <w:t xml:space="preserve"> Cited 182 times. IF=11.8/Q1.</w:t>
+        <w:t xml:space="preserve"> Cited 182 times. IF=11.8/Q1. Points=140.</w:t>
       </w:r>
     </w:p>
     <w:p>
@@ -4994,7 +4994,7 @@
           <w:b/>
           <w:sz w:val="22"/>
         </w:rPr>
-        <w:t xml:space="preserve"> Cited 108 times. IF=14.1/Q1.</w:t>
+        <w:t xml:space="preserve"> Cited 108 times. IF=14.1/Q1. Points=200.</w:t>
       </w:r>
     </w:p>
     <w:p>
@@ -5012,7 +5012,7 @@
           <w:b/>
           <w:sz w:val="22"/>
         </w:rPr>
-        <w:t xml:space="preserve"> Cited 30 times. IF=5.8/Q1.</w:t>
+        <w:t xml:space="preserve"> Cited 30 times. IF=5.8/Q1. Points=140.</w:t>
       </w:r>
     </w:p>
     <w:p>
@@ -5030,7 +5030,7 @@
           <w:b/>
           <w:sz w:val="22"/>
         </w:rPr>
-        <w:t xml:space="preserve"> Cited 21 times. IF=4/Q2.</w:t>
+        <w:t xml:space="preserve"> Cited 21 times. IF=4/Q2. Points=100.</w:t>
       </w:r>
     </w:p>
     <w:p>
@@ -5048,7 +5048,7 @@
           <w:b/>
           <w:sz w:val="22"/>
         </w:rPr>
-        <w:t xml:space="preserve"> Cited 15 times. IF=5.1/Q2.</w:t>
+        <w:t xml:space="preserve"> Cited 15 times. IF=5.1/Q2. Points=140.</w:t>
       </w:r>
     </w:p>
     <w:p>
@@ -5066,7 +5066,7 @@
           <w:b/>
           <w:sz w:val="22"/>
         </w:rPr>
-        <w:t xml:space="preserve"> Cited 87 times. IF=5.4/Q1.</w:t>
+        <w:t xml:space="preserve"> Cited 87 times. IF=5.4/Q1. Points=100.</w:t>
       </w:r>
     </w:p>
     <w:p>
@@ -5084,7 +5084,7 @@
           <w:b/>
           <w:sz w:val="22"/>
         </w:rPr>
-        <w:t xml:space="preserve"> Cited 18 times.</w:t>
+        <w:t xml:space="preserve"> Cited 18 times. Points=70.</w:t>
       </w:r>
     </w:p>
     <w:p>
@@ -5102,7 +5102,7 @@
           <w:b/>
           <w:sz w:val="22"/>
         </w:rPr>
-        <w:t xml:space="preserve"> Cited 378 times. IF=5.2/Q1.</w:t>
+        <w:t xml:space="preserve"> Cited 378 times. IF=5.2/Q1. Points=100.</w:t>
       </w:r>
     </w:p>
     <w:p>
@@ -5120,7 +5120,7 @@
           <w:b/>
           <w:sz w:val="22"/>
         </w:rPr>
-        <w:t xml:space="preserve"> Cited 10 times. IF=6.7/Q1.</w:t>
+        <w:t xml:space="preserve"> Cited 10 times. IF=6.7/Q1. Points=140.</w:t>
       </w:r>
     </w:p>
     <w:p>
@@ -5138,7 +5138,7 @@
           <w:b/>
           <w:sz w:val="22"/>
         </w:rPr>
-        <w:t xml:space="preserve"> Cited 191 times. IF=5.4/Q1.</w:t>
+        <w:t xml:space="preserve"> Cited 191 times. IF=5.4/Q1. Points=100.</w:t>
       </w:r>
     </w:p>
     <w:p>
@@ -5156,7 +5156,7 @@
           <w:b/>
           <w:sz w:val="22"/>
         </w:rPr>
-        <w:t xml:space="preserve"> Cited 6 times. IF=3.7/Q2.</w:t>
+        <w:t xml:space="preserve"> Cited 6 times. IF=3.7/Q2. Points=100.</w:t>
       </w:r>
     </w:p>
     <w:p>
@@ -5174,7 +5174,7 @@
           <w:b/>
           <w:sz w:val="22"/>
         </w:rPr>
-        <w:t xml:space="preserve"> Cited 245 times. IF=22.3/Q1.</w:t>
+        <w:t xml:space="preserve"> Cited 245 times. IF=22.3/Q1. Points=200.</w:t>
       </w:r>
     </w:p>
     <w:p>
@@ -5192,7 +5192,7 @@
           <w:b/>
           <w:sz w:val="22"/>
         </w:rPr>
-        <w:t xml:space="preserve"> Cited 116 times. IF=17.4/Q1.</w:t>
+        <w:t xml:space="preserve"> Cited 116 times. IF=17.4/Q1. Points=200.</w:t>
       </w:r>
     </w:p>
     <w:p>
@@ -5210,7 +5210,7 @@
           <w:b/>
           <w:sz w:val="22"/>
         </w:rPr>
-        <w:t xml:space="preserve"> Cited 438 times. IF=3.2/Q2.</w:t>
+        <w:t xml:space="preserve"> Cited 438 times. IF=3.2/Q2. Points=100.</w:t>
       </w:r>
     </w:p>
     <w:p>
@@ -5228,7 +5228,7 @@
           <w:b/>
           <w:sz w:val="22"/>
         </w:rPr>
-        <w:t xml:space="preserve"> Cited 51 times. IF=4/Q1.</w:t>
+        <w:t xml:space="preserve"> Cited 51 times. IF=4/Q1. Points=100.</w:t>
       </w:r>
     </w:p>
     <w:p>
@@ -5246,7 +5246,7 @@
           <w:b/>
           <w:sz w:val="22"/>
         </w:rPr>
-        <w:t xml:space="preserve"> Cited 35 times.</w:t>
+        <w:t xml:space="preserve"> Cited 35 times. Points=100.</w:t>
       </w:r>
     </w:p>
     <w:p>
@@ -5264,7 +5264,7 @@
           <w:b/>
           <w:sz w:val="22"/>
         </w:rPr>
-        <w:t xml:space="preserve"> Cited 21 times. IF=4.5/Q2.</w:t>
+        <w:t xml:space="preserve"> Cited 21 times. IF=4.5/Q2. Points=100.</w:t>
       </w:r>
     </w:p>
     <w:p>
@@ -5282,7 +5282,7 @@
           <w:b/>
           <w:sz w:val="22"/>
         </w:rPr>
-        <w:t xml:space="preserve"> Cited 23 times. IF=14.1/Q1.</w:t>
+        <w:t xml:space="preserve"> Cited 23 times. IF=14.1/Q1. Points=200.</w:t>
       </w:r>
     </w:p>
     <w:p>
@@ -5300,7 +5300,7 @@
           <w:b/>
           <w:sz w:val="22"/>
         </w:rPr>
-        <w:t xml:space="preserve"> Cited 82 times. IF=5.6/Q1.</w:t>
+        <w:t xml:space="preserve"> Cited 82 times. IF=5.6/Q1. Points=140.</w:t>
       </w:r>
     </w:p>
     <w:p>
@@ -5318,7 +5318,7 @@
           <w:b/>
           <w:sz w:val="22"/>
         </w:rPr>
-        <w:t xml:space="preserve"> Cited 36 times. IF=4.9/Q1.</w:t>
+        <w:t xml:space="preserve"> Cited 36 times. IF=4.9/Q1. Points=140.</w:t>
       </w:r>
     </w:p>
     <w:p>
@@ -5336,7 +5336,7 @@
           <w:b/>
           <w:sz w:val="22"/>
         </w:rPr>
-        <w:t xml:space="preserve"> Cited 50 times. IF=14.1/Q1.</w:t>
+        <w:t xml:space="preserve"> Cited 50 times. IF=14.1/Q1. Points=200.</w:t>
       </w:r>
     </w:p>
     <w:p>
@@ -5354,7 +5354,7 @@
           <w:b/>
           <w:sz w:val="22"/>
         </w:rPr>
-        <w:t xml:space="preserve"> Cited 193 times. IF=12.2/Q1.</w:t>
+        <w:t xml:space="preserve"> Cited 193 times. IF=12.2/Q1. Points=100.</w:t>
       </w:r>
     </w:p>
     <w:p>
@@ -5372,7 +5372,7 @@
           <w:b/>
           <w:sz w:val="22"/>
         </w:rPr>
-        <w:t xml:space="preserve"> Cited 16 times. IF=3.3/Q3.</w:t>
+        <w:t xml:space="preserve"> Cited 16 times. IF=3.3/Q3. Points=100.</w:t>
       </w:r>
     </w:p>
     <w:p>
@@ -5390,7 +5390,7 @@
           <w:b/>
           <w:sz w:val="22"/>
         </w:rPr>
-        <w:t xml:space="preserve"> Cited 38 times. IF=5.1/Q2.</w:t>
+        <w:t xml:space="preserve"> Cited 38 times. IF=5.1/Q2. Points=140.</w:t>
       </w:r>
     </w:p>
     <w:p>
@@ -5408,7 +5408,7 @@
           <w:b/>
           <w:sz w:val="22"/>
         </w:rPr>
-        <w:t xml:space="preserve"> Cited 2 times. IF=1.1/Q3.</w:t>
+        <w:t xml:space="preserve"> Cited 2 times. IF=1.1/Q3. Points=100.</w:t>
       </w:r>
     </w:p>
     <w:p>
@@ -5426,7 +5426,7 @@
           <w:b/>
           <w:sz w:val="22"/>
         </w:rPr>
-        <w:t xml:space="preserve"> Cited 22 times. IF=3.2/Q2.</w:t>
+        <w:t xml:space="preserve"> Cited 22 times. IF=3.2/Q2. Points=100.</w:t>
       </w:r>
     </w:p>
     <w:p>
@@ -5452,7 +5452,7 @@
           <w:b/>
           <w:sz w:val="22"/>
         </w:rPr>
-        <w:t xml:space="preserve"> Cited 124 times. IF=3.2/Q2.</w:t>
+        <w:t xml:space="preserve"> Cited 124 times. IF=3.2/Q2. Points=100.</w:t>
       </w:r>
     </w:p>
     <w:p>
@@ -5470,7 +5470,7 @@
           <w:b/>
           <w:sz w:val="22"/>
         </w:rPr>
-        <w:t xml:space="preserve"> Cited 89 times. IF=8.5/Q1.</w:t>
+        <w:t xml:space="preserve"> Cited 89 times. IF=8.5/Q1. Points=200.</w:t>
       </w:r>
     </w:p>
     <w:p>
@@ -5488,7 +5488,7 @@
           <w:b/>
           <w:sz w:val="22"/>
         </w:rPr>
-        <w:t xml:space="preserve"> Cited 320 times. IF=7/Q1.</w:t>
+        <w:t xml:space="preserve"> Cited 320 times. IF=7/Q1. Points=140.</w:t>
       </w:r>
     </w:p>
     <w:p>
@@ -5506,7 +5506,7 @@
           <w:b/>
           <w:sz w:val="22"/>
         </w:rPr>
-        <w:t xml:space="preserve"> Cited 48 times. IF=5.4/Q1.</w:t>
+        <w:t xml:space="preserve"> Cited 48 times. IF=5.4/Q1. Points=100.</w:t>
       </w:r>
     </w:p>
     <w:p>
@@ -5524,7 +5524,7 @@
           <w:b/>
           <w:sz w:val="22"/>
         </w:rPr>
-        <w:t xml:space="preserve"> Cited 32 times. IF=5.4/Q1.</w:t>
+        <w:t xml:space="preserve"> Cited 32 times. IF=5.4/Q1. Points=100.</w:t>
       </w:r>
     </w:p>
     <w:p>
@@ -5542,7 +5542,7 @@
           <w:b/>
           <w:sz w:val="22"/>
         </w:rPr>
-        <w:t xml:space="preserve"> Cited 22 times. IF=2.1/Q2.</w:t>
+        <w:t xml:space="preserve"> Cited 22 times. IF=2.1/Q2. Points=100.</w:t>
       </w:r>
     </w:p>
     <w:p>
@@ -5560,7 +5560,7 @@
           <w:b/>
           <w:sz w:val="22"/>
         </w:rPr>
-        <w:t xml:space="preserve"> Cited 13 times. IF=3.2/Q2.</w:t>
+        <w:t xml:space="preserve"> Cited 13 times. IF=3.2/Q2. Points=70.</w:t>
       </w:r>
     </w:p>
     <w:p>
@@ -5578,7 +5578,7 @@
           <w:b/>
           <w:sz w:val="22"/>
         </w:rPr>
-        <w:t xml:space="preserve"> Cited 29 times. IF=6/Q1.</w:t>
+        <w:t xml:space="preserve"> Cited 29 times. IF=6/Q1. Points=140.</w:t>
       </w:r>
     </w:p>
     <w:p>
@@ -5596,7 +5596,7 @@
           <w:b/>
           <w:sz w:val="22"/>
         </w:rPr>
-        <w:t xml:space="preserve"> Cited 20 times. IF=5.1/Q2.</w:t>
+        <w:t xml:space="preserve"> Cited 20 times. IF=5.1/Q2. Points=140.</w:t>
       </w:r>
     </w:p>
     <w:p>
@@ -5614,7 +5614,7 @@
           <w:b/>
           <w:sz w:val="22"/>
         </w:rPr>
-        <w:t xml:space="preserve"> Cited 13 times. IF=3.7/Q2.</w:t>
+        <w:t xml:space="preserve"> Cited 13 times. IF=3.7/Q2. Points=100.</w:t>
       </w:r>
     </w:p>
     <w:p>
@@ -5632,7 +5632,7 @@
           <w:b/>
           <w:sz w:val="22"/>
         </w:rPr>
-        <w:t xml:space="preserve"> Cited 64 times. IF=5.4/Q1.</w:t>
+        <w:t xml:space="preserve"> Cited 64 times. IF=5.4/Q1. Points=100.</w:t>
       </w:r>
     </w:p>
     <w:p>
@@ -5650,7 +5650,7 @@
           <w:b/>
           <w:sz w:val="22"/>
         </w:rPr>
-        <w:t xml:space="preserve"> Cited 47 times. IF=5.4/Q1.</w:t>
+        <w:t xml:space="preserve"> Cited 47 times. IF=5.4/Q1. Points=100.</w:t>
       </w:r>
     </w:p>
     <w:p>
@@ -5668,7 +5668,7 @@
           <w:b/>
           <w:sz w:val="22"/>
         </w:rPr>
-        <w:t xml:space="preserve"> Cited 9 times. IF=7.3/Q1.</w:t>
+        <w:t xml:space="preserve"> Cited 9 times. IF=7.3/Q1. Points=100.</w:t>
       </w:r>
     </w:p>
     <w:p>
@@ -5686,7 +5686,7 @@
           <w:b/>
           <w:sz w:val="22"/>
         </w:rPr>
-        <w:t xml:space="preserve"> Cited 97 times. IF=20.3/Q1.</w:t>
+        <w:t xml:space="preserve"> Cited 97 times. IF=20.3/Q1. Points=140.</w:t>
       </w:r>
     </w:p>
     <w:p>
@@ -5704,7 +5704,7 @@
           <w:b/>
           <w:sz w:val="22"/>
         </w:rPr>
-        <w:t xml:space="preserve"> Cited 26 times. IF=5.4/Q1.</w:t>
+        <w:t xml:space="preserve"> Cited 26 times. IF=5.4/Q1. Points=100.</w:t>
       </w:r>
     </w:p>
     <w:p>
@@ -5722,7 +5722,7 @@
           <w:b/>
           <w:sz w:val="22"/>
         </w:rPr>
-        <w:t xml:space="preserve"> Cited 5 times. IF=5.1/Q2.</w:t>
+        <w:t xml:space="preserve"> Cited 5 times. IF=5.1/Q2. Points=140.</w:t>
       </w:r>
     </w:p>
     <w:p>
@@ -5740,7 +5740,7 @@
           <w:b/>
           <w:sz w:val="22"/>
         </w:rPr>
-        <w:t xml:space="preserve"> Cited 107 times. IF=5.4/Q1.</w:t>
+        <w:t xml:space="preserve"> Cited 107 times. IF=5.4/Q1. Points=100.</w:t>
       </w:r>
     </w:p>
     <w:p>
@@ -5758,7 +5758,7 @@
           <w:b/>
           <w:sz w:val="22"/>
         </w:rPr>
-        <w:t xml:space="preserve"> Cited 10 times. IF=5.4/Q1.</w:t>
+        <w:t xml:space="preserve"> Cited 10 times. IF=5.4/Q1. Points=100.</w:t>
       </w:r>
     </w:p>
     <w:p>
@@ -5776,7 +5776,7 @@
           <w:b/>
           <w:sz w:val="22"/>
         </w:rPr>
-        <w:t xml:space="preserve"> Cited 100 times. IF=20.3/Q1.</w:t>
+        <w:t xml:space="preserve"> Cited 100 times. IF=20.3/Q1. Points=140.</w:t>
       </w:r>
     </w:p>
     <w:p>
@@ -5794,7 +5794,7 @@
           <w:b/>
           <w:sz w:val="22"/>
         </w:rPr>
-        <w:t xml:space="preserve"> Cited 30 times. IF=3.7/Q2.</w:t>
+        <w:t xml:space="preserve"> Cited 30 times. IF=3.7/Q2. Points=100.</w:t>
       </w:r>
     </w:p>
     <w:p>
@@ -5812,7 +5812,7 @@
           <w:b/>
           <w:sz w:val="22"/>
         </w:rPr>
-        <w:t xml:space="preserve"> Cited 26 times. IF=16.6/Q1.</w:t>
+        <w:t xml:space="preserve"> Cited 26 times. IF=16.6/Q1. Points=200.</w:t>
       </w:r>
     </w:p>
     <w:p>
@@ -5830,7 +5830,7 @@
           <w:b/>
           <w:sz w:val="22"/>
         </w:rPr>
-        <w:t xml:space="preserve"> Cited 4 times. IF=11.3/Q1.</w:t>
+        <w:t xml:space="preserve"> Cited 4 times. IF=11.3/Q1. Points=140.</w:t>
       </w:r>
     </w:p>
     <w:p>
@@ -5848,7 +5848,7 @@
           <w:b/>
           <w:sz w:val="22"/>
         </w:rPr>
-        <w:t xml:space="preserve"> Cited 31 times. IF=6.7/Q1.</w:t>
+        <w:t xml:space="preserve"> Cited 31 times. IF=6.7/Q1. Points=100.</w:t>
       </w:r>
     </w:p>
     <w:p>
@@ -5866,7 +5866,7 @@
           <w:b/>
           <w:sz w:val="22"/>
         </w:rPr>
-        <w:t xml:space="preserve"> Cited 46 times. IF=4.5/Q2.</w:t>
+        <w:t xml:space="preserve"> Cited 46 times. IF=4.5/Q2. Points=100.</w:t>
       </w:r>
     </w:p>
     <w:p>
@@ -5884,7 +5884,7 @@
           <w:b/>
           <w:sz w:val="22"/>
         </w:rPr>
-        <w:t xml:space="preserve"> Cited 7 times. IF=3.7/Q2.</w:t>
+        <w:t xml:space="preserve"> Cited 7 times. IF=3.7/Q2. Points=100.</w:t>
       </w:r>
     </w:p>
     <w:p>
@@ -5902,7 +5902,7 @@
           <w:b/>
           <w:sz w:val="22"/>
         </w:rPr>
-        <w:t xml:space="preserve"> Cited 17 times. IF=4.9/Q1.</w:t>
+        <w:t xml:space="preserve"> Cited 17 times. IF=4.9/Q1. Points=140.</w:t>
       </w:r>
     </w:p>
     <w:p>
@@ -5928,7 +5928,7 @@
           <w:b/>
           <w:sz w:val="22"/>
         </w:rPr>
-        <w:t xml:space="preserve"> Cited 40 times. IF=5.1/Q2.</w:t>
+        <w:t xml:space="preserve"> Cited 40 times. IF=5.1/Q2. Points=140.</w:t>
       </w:r>
     </w:p>
     <w:p>
@@ -5946,7 +5946,7 @@
           <w:b/>
           <w:sz w:val="22"/>
         </w:rPr>
-        <w:t xml:space="preserve"> Cited 32 times. IF=3.7/Q2.</w:t>
+        <w:t xml:space="preserve"> Cited 32 times. IF=3.7/Q2. Points=100.</w:t>
       </w:r>
     </w:p>
     <w:p>
@@ -5964,7 +5964,7 @@
           <w:b/>
           <w:sz w:val="22"/>
         </w:rPr>
-        <w:t xml:space="preserve"> Cited 87 times. IF=5.4/Q1.</w:t>
+        <w:t xml:space="preserve"> Cited 87 times. IF=5.4/Q1. Points=100.</w:t>
       </w:r>
     </w:p>
     <w:p>
@@ -5982,7 +5982,7 @@
           <w:b/>
           <w:sz w:val="22"/>
         </w:rPr>
-        <w:t xml:space="preserve"> Cited 28 times. IF=5.1/Q2.</w:t>
+        <w:t xml:space="preserve"> Cited 28 times. IF=5.1/Q2. Points=140.</w:t>
       </w:r>
     </w:p>
     <w:p>
@@ -6000,7 +6000,7 @@
           <w:b/>
           <w:sz w:val="22"/>
         </w:rPr>
-        <w:t xml:space="preserve"> Cited 22 times. IF=2.2/Q3.</w:t>
+        <w:t xml:space="preserve"> Cited 22 times. IF=2.2/Q3. Points=40.</w:t>
       </w:r>
     </w:p>
     <w:p>
@@ -6018,7 +6018,7 @@
           <w:b/>
           <w:sz w:val="22"/>
         </w:rPr>
-        <w:t xml:space="preserve"> Cited 22 times. IF=3.1/Q2.</w:t>
+        <w:t xml:space="preserve"> Cited 22 times. IF=3.1/Q2. Points=140.</w:t>
       </w:r>
     </w:p>
     <w:p>
@@ -6036,7 +6036,7 @@
           <w:b/>
           <w:sz w:val="22"/>
         </w:rPr>
-        <w:t xml:space="preserve"> Cited 6 times. IF=5.1/Q2.</w:t>
+        <w:t xml:space="preserve"> Cited 6 times. IF=5.1/Q2. Points=140.</w:t>
       </w:r>
     </w:p>
     <w:p>
@@ -6054,7 +6054,7 @@
           <w:b/>
           <w:sz w:val="22"/>
         </w:rPr>
-        <w:t xml:space="preserve"> Cited 26 times. IF=4.9/Q1.</w:t>
+        <w:t xml:space="preserve"> Cited 26 times. IF=4.9/Q1. Points=140.</w:t>
       </w:r>
     </w:p>
     <w:p>
@@ -6072,7 +6072,7 @@
           <w:b/>
           <w:sz w:val="22"/>
         </w:rPr>
-        <w:t xml:space="preserve"> Cited 163 times. IF=5.1/Q2.</w:t>
+        <w:t xml:space="preserve"> Cited 163 times. IF=5.1/Q2. Points=140.</w:t>
       </w:r>
     </w:p>
     <w:p>
@@ -6090,7 +6090,7 @@
           <w:b/>
           <w:sz w:val="22"/>
         </w:rPr>
-        <w:t xml:space="preserve"> Cited 19 times. IF=11.8/Q1.</w:t>
+        <w:t xml:space="preserve"> Cited 19 times. IF=11.8/Q1. Points=140.</w:t>
       </w:r>
     </w:p>
     <w:p>
@@ -6116,7 +6116,7 @@
           <w:b/>
           <w:sz w:val="22"/>
         </w:rPr>
-        <w:t xml:space="preserve"> Cited 17 times. IF=2.1/Q2.</w:t>
+        <w:t xml:space="preserve"> Cited 17 times. IF=2.1/Q2. Points=100.</w:t>
       </w:r>
     </w:p>
     <w:p>
@@ -6134,7 +6134,7 @@
           <w:b/>
           <w:sz w:val="22"/>
         </w:rPr>
-        <w:t xml:space="preserve"> Cited 42 times. IF=4.5/Q2.</w:t>
+        <w:t xml:space="preserve"> Cited 42 times. IF=4.5/Q2. Points=100.</w:t>
       </w:r>
     </w:p>
     <w:p>
@@ -6152,7 +6152,7 @@
           <w:b/>
           <w:sz w:val="22"/>
         </w:rPr>
-        <w:t xml:space="preserve"> Cited 5 times. IF=2.4/Q3.</w:t>
+        <w:t xml:space="preserve"> Cited 5 times. IF=2.4/Q3. Points=70.</w:t>
       </w:r>
     </w:p>
     <w:p>
@@ -6170,7 +6170,7 @@
           <w:b/>
           <w:sz w:val="22"/>
         </w:rPr>
-        <w:t xml:space="preserve"> Cited 23 times. IF=2.1/Q2.</w:t>
+        <w:t xml:space="preserve"> Cited 23 times. IF=2.1/Q2. Points=100.</w:t>
       </w:r>
     </w:p>
     <w:p>
@@ -6188,7 +6188,7 @@
           <w:b/>
           <w:sz w:val="22"/>
         </w:rPr>
-        <w:t xml:space="preserve"> Cited 240 times. IF=8/Q1.</w:t>
+        <w:t xml:space="preserve"> Cited 240 times. IF=8/Q1. Points=140.</w:t>
       </w:r>
     </w:p>
     <w:p>
@@ -6206,7 +6206,7 @@
           <w:b/>
           <w:sz w:val="22"/>
         </w:rPr>
-        <w:t xml:space="preserve"> Cited 10 times. IF=11.3/Q1.</w:t>
+        <w:t xml:space="preserve"> Cited 10 times. IF=11.3/Q1. Points=140.</w:t>
       </w:r>
     </w:p>
     <w:p>
@@ -6242,7 +6242,7 @@
           <w:b/>
           <w:sz w:val="22"/>
         </w:rPr>
-        <w:t xml:space="preserve"> Cited 2624 times. IF=14.1/Q1.</w:t>
+        <w:t xml:space="preserve"> Cited 2624 times. IF=14.1/Q1. Points=200.</w:t>
       </w:r>
     </w:p>
     <w:p>
@@ -6260,7 +6260,7 @@
           <w:b/>
           <w:sz w:val="22"/>
         </w:rPr>
-        <w:t xml:space="preserve"> Cited 82 times.</w:t>
+        <w:t xml:space="preserve"> Cited 82 times. Points=20.</w:t>
       </w:r>
     </w:p>
     <w:p>
@@ -6278,7 +6278,7 @@
           <w:b/>
           <w:sz w:val="22"/>
         </w:rPr>
-        <w:t xml:space="preserve"> Cited 22 times. IF=5.1/Q2.</w:t>
+        <w:t xml:space="preserve"> Cited 22 times. IF=5.1/Q2. Points=140.</w:t>
       </w:r>
     </w:p>
     <w:p>
@@ -6296,7 +6296,7 @@
           <w:b/>
           <w:sz w:val="22"/>
         </w:rPr>
-        <w:t xml:space="preserve"> Cited 7 times.</w:t>
+        <w:t xml:space="preserve"> Cited 7 times. Points=70.</w:t>
       </w:r>
     </w:p>
     <w:p>
@@ -6314,7 +6314,7 @@
           <w:b/>
           <w:sz w:val="22"/>
         </w:rPr>
-        <w:t xml:space="preserve"> Cited 9 times. IF=11.8/Q1.</w:t>
+        <w:t xml:space="preserve"> Cited 9 times. IF=11.8/Q1. Points=140.</w:t>
       </w:r>
     </w:p>
     <w:p>
@@ -6332,7 +6332,7 @@
           <w:b/>
           <w:sz w:val="22"/>
         </w:rPr>
-        <w:t xml:space="preserve"> Cited 63 times. IF=6.8/Q1.</w:t>
+        <w:t xml:space="preserve"> Cited 63 times. IF=6.8/Q1. Points=140.</w:t>
       </w:r>
     </w:p>
     <w:p>
@@ -6358,7 +6358,7 @@
           <w:b/>
           <w:sz w:val="22"/>
         </w:rPr>
-        <w:t xml:space="preserve"> Cited 22 times. IF=12.5/Q1.</w:t>
+        <w:t xml:space="preserve"> Cited 22 times. IF=12.5/Q1. Points=140.</w:t>
       </w:r>
     </w:p>
     <w:p>
@@ -6376,7 +6376,7 @@
           <w:b/>
           <w:sz w:val="22"/>
         </w:rPr>
-        <w:t xml:space="preserve"> Cited 38 times. IF=3.7/Q2.</w:t>
+        <w:t xml:space="preserve"> Cited 38 times. IF=3.7/Q2. Points=100.</w:t>
       </w:r>
     </w:p>
     <w:p>
@@ -6394,7 +6394,7 @@
           <w:b/>
           <w:sz w:val="22"/>
         </w:rPr>
-        <w:t xml:space="preserve"> Cited 37 times. IF=3.7/Q2.</w:t>
+        <w:t xml:space="preserve"> Cited 37 times. IF=3.7/Q2. Points=100.</w:t>
       </w:r>
     </w:p>
     <w:p>
@@ -6412,7 +6412,7 @@
           <w:b/>
           <w:sz w:val="22"/>
         </w:rPr>
-        <w:t xml:space="preserve"> Cited 43 times. IF=6.8/Q1.</w:t>
+        <w:t xml:space="preserve"> Cited 43 times. IF=6.8/Q1. Points=140.</w:t>
       </w:r>
     </w:p>
     <w:p>
@@ -6430,7 +6430,7 @@
           <w:b/>
           <w:sz w:val="22"/>
         </w:rPr>
-        <w:t xml:space="preserve"> Cited 59 times. IF=3.7/Q2.</w:t>
+        <w:t xml:space="preserve"> Cited 59 times. IF=3.7/Q2. Points=100.</w:t>
       </w:r>
     </w:p>
     <w:p>
@@ -6448,7 +6448,7 @@
           <w:b/>
           <w:sz w:val="22"/>
         </w:rPr>
-        <w:t xml:space="preserve"> Cited 588 times. IF=6.5/Q1.</w:t>
+        <w:t xml:space="preserve"> Cited 588 times. IF=6.5/Q1. Points=100.</w:t>
       </w:r>
     </w:p>
     <w:p>
@@ -6466,7 +6466,7 @@
           <w:b/>
           <w:sz w:val="22"/>
         </w:rPr>
-        <w:t xml:space="preserve"> Cited 82 times. IF=3.7/Q2.</w:t>
+        <w:t xml:space="preserve"> Cited 82 times. IF=3.7/Q2. Points=100.</w:t>
       </w:r>
     </w:p>
     <w:p>
@@ -6484,7 +6484,7 @@
           <w:b/>
           <w:sz w:val="22"/>
         </w:rPr>
-        <w:t xml:space="preserve"> Cited 72 times. IF=7.5/Q1.</w:t>
+        <w:t xml:space="preserve"> Cited 72 times. IF=7.5/Q1. Points=140.</w:t>
       </w:r>
     </w:p>
     <w:p>
@@ -6502,7 +6502,7 @@
           <w:b/>
           <w:sz w:val="22"/>
         </w:rPr>
-        <w:t xml:space="preserve"> Cited 75 times. IF=6.8/Q1.</w:t>
+        <w:t xml:space="preserve"> Cited 75 times. IF=6.8/Q1. Points=140.</w:t>
       </w:r>
     </w:p>
     <w:p>
@@ -6520,7 +6520,7 @@
           <w:b/>
           <w:sz w:val="22"/>
         </w:rPr>
-        <w:t xml:space="preserve"> Cited 27 times. IF=2.8/Q2.</w:t>
+        <w:t xml:space="preserve"> Cited 27 times. IF=2.8/Q2. Points=100.</w:t>
       </w:r>
     </w:p>
     <w:p>
@@ -6538,7 +6538,7 @@
           <w:b/>
           <w:sz w:val="22"/>
         </w:rPr>
-        <w:t xml:space="preserve"> Cited 25 times. IF=10.9/Q1.</w:t>
+        <w:t xml:space="preserve"> Cited 25 times. IF=10.9/Q1. Points=140.</w:t>
       </w:r>
     </w:p>
     <w:p>
@@ -6564,7 +6564,7 @@
           <w:b/>
           <w:sz w:val="22"/>
         </w:rPr>
-        <w:t xml:space="preserve"> Cited 24 times. IF=7.8/Q1.</w:t>
+        <w:t xml:space="preserve"> Cited 24 times. IF=7.8/Q1. Points=140.</w:t>
       </w:r>
     </w:p>
     <w:p>
@@ -6582,7 +6582,7 @@
           <w:b/>
           <w:sz w:val="22"/>
         </w:rPr>
-        <w:t xml:space="preserve"> Cited 32 times. IF=2.8/Q2.</w:t>
+        <w:t xml:space="preserve"> Cited 32 times. IF=2.8/Q2. Points=100.</w:t>
       </w:r>
     </w:p>
     <w:p>
@@ -6600,7 +6600,7 @@
           <w:b/>
           <w:sz w:val="22"/>
         </w:rPr>
-        <w:t xml:space="preserve"> Cited 71 times. IF=2.8/Q2.</w:t>
+        <w:t xml:space="preserve"> Cited 71 times. IF=2.8/Q2. Points=100.</w:t>
       </w:r>
     </w:p>
     <w:p>
@@ -6618,7 +6618,7 @@
           <w:b/>
           <w:sz w:val="22"/>
         </w:rPr>
-        <w:t xml:space="preserve"> Cited 130 times. IF=2.9/Q2.</w:t>
+        <w:t xml:space="preserve"> Cited 130 times. IF=2.9/Q2. Points=100.</w:t>
       </w:r>
     </w:p>
     <w:p>
@@ -6636,7 +6636,7 @@
           <w:b/>
           <w:sz w:val="22"/>
         </w:rPr>
-        <w:t xml:space="preserve"> Cited 28 times. IF=4.1/Q2.</w:t>
+        <w:t xml:space="preserve"> Cited 28 times. IF=4.1/Q2. Points=100.</w:t>
       </w:r>
     </w:p>
     <w:p>
@@ -6654,7 +6654,7 @@
           <w:b/>
           <w:sz w:val="22"/>
         </w:rPr>
-        <w:t xml:space="preserve"> Cited 26 times. IF=10.9/Q1.</w:t>
+        <w:t xml:space="preserve"> Cited 26 times. IF=10.9/Q1. Points=140.</w:t>
       </w:r>
     </w:p>
     <w:p>
@@ -6672,7 +6672,7 @@
           <w:b/>
           <w:sz w:val="22"/>
         </w:rPr>
-        <w:t xml:space="preserve"> Cited 258 times. IF=6.8/Q1.</w:t>
+        <w:t xml:space="preserve"> Cited 258 times. IF=6.8/Q1. Points=140.</w:t>
       </w:r>
     </w:p>
     <w:p>
@@ -6690,7 +6690,7 @@
           <w:b/>
           <w:sz w:val="22"/>
         </w:rPr>
-        <w:t xml:space="preserve"> Cited 42 times. IF=10.9/Q1.</w:t>
+        <w:t xml:space="preserve"> Cited 42 times. IF=10.9/Q1. Points=140.</w:t>
       </w:r>
     </w:p>
     <w:p>
@@ -6726,7 +6726,7 @@
           <w:b/>
           <w:sz w:val="22"/>
         </w:rPr>
-        <w:t xml:space="preserve"> Cited 38 times.</w:t>
+        <w:t xml:space="preserve"> Cited 38 times. Points=20.</w:t>
       </w:r>
     </w:p>
     <w:p>
@@ -6752,7 +6752,7 @@
           <w:b/>
           <w:sz w:val="22"/>
         </w:rPr>
-        <w:t xml:space="preserve"> Cited 24 times. IF=2.1/Q2.</w:t>
+        <w:t xml:space="preserve"> Cited 24 times. IF=2.1/Q2. Points=100.</w:t>
       </w:r>
     </w:p>
     <w:p>
@@ -6770,7 +6770,7 @@
           <w:b/>
           <w:sz w:val="22"/>
         </w:rPr>
-        <w:t xml:space="preserve"> Cited 34 times.</w:t>
+        <w:t xml:space="preserve"> Cited 34 times. Points=20.</w:t>
       </w:r>
     </w:p>
     <w:p>
@@ -6788,7 +6788,7 @@
           <w:b/>
           <w:sz w:val="22"/>
         </w:rPr>
-        <w:t xml:space="preserve"> Cited 30 times. IF=7.3/Q1.</w:t>
+        <w:t xml:space="preserve"> Cited 30 times. IF=7.3/Q1. Points=100.</w:t>
       </w:r>
     </w:p>
     <w:p>
@@ -6806,7 +6806,7 @@
           <w:b/>
           <w:sz w:val="22"/>
         </w:rPr>
-        <w:t xml:space="preserve"> Cited 49 times. IF=8/Q1.</w:t>
+        <w:t xml:space="preserve"> Cited 49 times. IF=8/Q1. Points=140.</w:t>
       </w:r>
     </w:p>
     <w:p>
@@ -6824,7 +6824,7 @@
           <w:b/>
           <w:sz w:val="22"/>
         </w:rPr>
-        <w:t xml:space="preserve"> Cited 27 times. IF=6.5/Q1.</w:t>
+        <w:t xml:space="preserve"> Cited 27 times. IF=6.5/Q1. Points=100.</w:t>
       </w:r>
     </w:p>
     <w:p>
@@ -6842,7 +6842,7 @@
           <w:b/>
           <w:sz w:val="22"/>
         </w:rPr>
-        <w:t xml:space="preserve"> Cited 31 times. IF=2.1/Q2.</w:t>
+        <w:t xml:space="preserve"> Cited 31 times. IF=2.1/Q2. Points=100.</w:t>
       </w:r>
     </w:p>
     <w:p>
@@ -6860,7 +6860,7 @@
           <w:b/>
           <w:sz w:val="22"/>
         </w:rPr>
-        <w:t xml:space="preserve"> Cited 42 times. IF=2.1/Q2.</w:t>
+        <w:t xml:space="preserve"> Cited 42 times. IF=2.1/Q2. Points=100.</w:t>
       </w:r>
     </w:p>
     <w:p>
@@ -6886,7 +6886,7 @@
           <w:b/>
           <w:sz w:val="22"/>
         </w:rPr>
-        <w:t xml:space="preserve"> Cited 32 times. IF=3.7/Q2.</w:t>
+        <w:t xml:space="preserve"> Cited 32 times. IF=3.7/Q2. Points=100.</w:t>
       </w:r>
     </w:p>
     <w:p>
@@ -6904,7 +6904,7 @@
           <w:b/>
           <w:sz w:val="22"/>
         </w:rPr>
-        <w:t xml:space="preserve"> Cited 23 times. IF=4.5/Q2.</w:t>
+        <w:t xml:space="preserve"> Cited 23 times. IF=4.5/Q2. Points=100.</w:t>
       </w:r>
     </w:p>
     <w:p>
@@ -6922,7 +6922,7 @@
           <w:b/>
           <w:sz w:val="22"/>
         </w:rPr>
-        <w:t xml:space="preserve"> Cited 48 times. IF=2.3/Q2.</w:t>
+        <w:t xml:space="preserve"> Cited 48 times. IF=2.3/Q2. Points=70.</w:t>
       </w:r>
     </w:p>
     <w:p>
@@ -6940,7 +6940,7 @@
           <w:b/>
           <w:sz w:val="22"/>
         </w:rPr>
-        <w:t xml:space="preserve"> Cited 29 times. IF=12.5/Q1.</w:t>
+        <w:t xml:space="preserve"> Cited 29 times. IF=12.5/Q1. Points=140.</w:t>
       </w:r>
     </w:p>
     <w:p>
@@ -6958,7 +6958,7 @@
           <w:b/>
           <w:sz w:val="22"/>
         </w:rPr>
-        <w:t xml:space="preserve"> Cited 65 times. IF=3.7/Q2.</w:t>
+        <w:t xml:space="preserve"> Cited 65 times. IF=3.7/Q2. Points=100.</w:t>
       </w:r>
     </w:p>
     <w:p>
@@ -6984,7 +6984,7 @@
           <w:b/>
           <w:sz w:val="22"/>
         </w:rPr>
-        <w:t xml:space="preserve"> Cited 53 times. IF=8.8/Q1.</w:t>
+        <w:t xml:space="preserve"> Cited 53 times. IF=8.8/Q1. Points=140.</w:t>
       </w:r>
     </w:p>
     <w:p>
@@ -7002,7 +7002,7 @@
           <w:b/>
           <w:sz w:val="22"/>
         </w:rPr>
-        <w:t xml:space="preserve"> Cited 63 times. IF=3.7/Q2.</w:t>
+        <w:t xml:space="preserve"> Cited 63 times. IF=3.7/Q2. Points=100.</w:t>
       </w:r>
     </w:p>
     <w:p>
@@ -7020,7 +7020,7 @@
           <w:b/>
           <w:sz w:val="22"/>
         </w:rPr>
-        <w:t xml:space="preserve"> Cited 73 times. IF=3/Q2.</w:t>
+        <w:t xml:space="preserve"> Cited 73 times. IF=3/Q2. Points=140.</w:t>
       </w:r>
     </w:p>
     <w:p>
@@ -7046,7 +7046,7 @@
           <w:b/>
           <w:sz w:val="22"/>
         </w:rPr>
-        <w:t xml:space="preserve"> Cited 37 times. IF=2.7/Q3.</w:t>
+        <w:t xml:space="preserve"> Cited 37 times. IF=2.7/Q3. Points=70.</w:t>
       </w:r>
     </w:p>
     <w:p>
@@ -7072,7 +7072,7 @@
           <w:b/>
           <w:sz w:val="22"/>
         </w:rPr>
-        <w:t xml:space="preserve"> Cited 47 times. IF=4.3/Q2.</w:t>
+        <w:t xml:space="preserve"> Cited 47 times. IF=4.3/Q2. Points=140.</w:t>
       </w:r>
     </w:p>
     <w:p>
@@ -7090,7 +7090,7 @@
           <w:b/>
           <w:sz w:val="22"/>
         </w:rPr>
-        <w:t xml:space="preserve"> Cited 35 times. IF=4.3/Q1.</w:t>
+        <w:t xml:space="preserve"> Cited 35 times. IF=4.3/Q1. Points=140.</w:t>
       </w:r>
     </w:p>
     <w:p>
@@ -7116,7 +7116,7 @@
           <w:b/>
           <w:sz w:val="22"/>
         </w:rPr>
-        <w:t xml:space="preserve"> Cited 45 times. IF=9.7/Q1.</w:t>
+        <w:t xml:space="preserve"> Cited 45 times. IF=9.7/Q1. Points=200.</w:t>
       </w:r>
     </w:p>
     <w:p>
@@ -7134,7 +7134,7 @@
           <w:b/>
           <w:sz w:val="22"/>
         </w:rPr>
-        <w:t xml:space="preserve"> Cited 37 times. IF=2.8/Q2.</w:t>
+        <w:t xml:space="preserve"> Cited 37 times. IF=2.8/Q2. Points=100.</w:t>
       </w:r>
     </w:p>
     <w:p>
@@ -7152,7 +7152,7 @@
           <w:b/>
           <w:sz w:val="22"/>
         </w:rPr>
-        <w:t xml:space="preserve"> Cited 52 times. IF=3.8/Q2.</w:t>
+        <w:t xml:space="preserve"> Cited 52 times. IF=3.8/Q2. Points=200.</w:t>
       </w:r>
     </w:p>
     <w:p>
@@ -7170,7 +7170,7 @@
           <w:b/>
           <w:sz w:val="22"/>
         </w:rPr>
-        <w:t xml:space="preserve"> Cited 52 times. IF=2/Q3.</w:t>
+        <w:t xml:space="preserve"> Cited 52 times. IF=2/Q3. Points=70.</w:t>
       </w:r>
     </w:p>
     <w:p>
@@ -7196,7 +7196,7 @@
           <w:b/>
           <w:sz w:val="22"/>
         </w:rPr>
-        <w:t xml:space="preserve"> Cited 44 times. IF=3.1/Q2.</w:t>
+        <w:t xml:space="preserve"> Cited 44 times. IF=3.1/Q2. Points=100.</w:t>
       </w:r>
     </w:p>
     <w:p>
@@ -7214,7 +7214,7 @@
           <w:b/>
           <w:sz w:val="22"/>
         </w:rPr>
-        <w:t xml:space="preserve"> Cited 69 times. IF=3.1/Q3.</w:t>
+        <w:t xml:space="preserve"> Cited 69 times. IF=3.1/Q3. Points=100.</w:t>
       </w:r>
     </w:p>
     <w:p>
@@ -7232,7 +7232,7 @@
           <w:b/>
           <w:sz w:val="22"/>
         </w:rPr>
-        <w:t xml:space="preserve"> Cited 69 times. IF=3.4/Q2.</w:t>
+        <w:t xml:space="preserve"> Cited 69 times. IF=3.4/Q2. Points=100.</w:t>
       </w:r>
     </w:p>
     <w:p>
@@ -7258,7 +7258,7 @@
           <w:b/>
           <w:sz w:val="22"/>
         </w:rPr>
-        <w:t xml:space="preserve"> Cited 80 times. IF=10.9/Q1.</w:t>
+        <w:t xml:space="preserve"> Cited 80 times. IF=10.9/Q1. Points=140.</w:t>
       </w:r>
     </w:p>
     <w:p>
@@ -7284,7 +7284,7 @@
           <w:b/>
           <w:sz w:val="22"/>
         </w:rPr>
-        <w:t xml:space="preserve"> Cited 197 times. IF=3.1/Q2.</w:t>
+        <w:t xml:space="preserve"> Cited 197 times. IF=3.1/Q2. Points=100.</w:t>
       </w:r>
     </w:p>
     <w:p>
@@ -7302,7 +7302,7 @@
           <w:b/>
           <w:sz w:val="22"/>
         </w:rPr>
-        <w:t xml:space="preserve"> Cited 52 times. IF=4.1/Q2.</w:t>
+        <w:t xml:space="preserve"> Cited 52 times. IF=4.1/Q2. Points=100.</w:t>
       </w:r>
     </w:p>
     <w:p>
@@ -7328,7 +7328,7 @@
           <w:b/>
           <w:sz w:val="22"/>
         </w:rPr>
-        <w:t xml:space="preserve"> Cited 102 times. IF=3.4/Q2.</w:t>
+        <w:t xml:space="preserve"> Cited 102 times. IF=3.4/Q2. Points=100.</w:t>
       </w:r>
     </w:p>
     <w:p>
@@ -7346,7 +7346,7 @@
           <w:b/>
           <w:sz w:val="22"/>
         </w:rPr>
-        <w:t xml:space="preserve"> Cited 96 times. IF=2.5/Q3.</w:t>
+        <w:t xml:space="preserve"> Cited 96 times. IF=2.5/Q3. Points=100.</w:t>
       </w:r>
     </w:p>
     <w:sectPr>

</xml_diff>